<commit_message>
Lock ATMCS 13 travel at £2,150 for University approval.
Sync the 21 Oct Stockholm planner through the JeS cost pack, capability note, timeline, and V&A dissemination wording before institutional review.

Co-authored-by: Cursor <cursoragent@cursor.com>
</commit_message>
<xml_diff>
--- a/08_current/grant/live/03_Applicant_and_Team_Capability.docx
+++ b/08_current/grant/live/03_Applicant_and_Team_Capability.docx
@@ -1,23 +1,23 @@
 
 <file path=word/document.xml><?xml version="1.0" encoding="utf-8"?>
-<w:document xmlns:w="http://schemas.openxmlformats.org/wordprocessingml/2006/main" xmlns:m="http://schemas.openxmlformats.org/officeDocument/2006/math" xmlns:r="http://schemas.openxmlformats.org/officeDocument/2006/relationships" xmlns:o="urn:schemas-microsoft-com:office:office" xmlns:v="urn:schemas-microsoft-com:vml" xmlns:w10="urn:schemas-microsoft-com:office:word" xmlns:a="http://schemas.openxmlformats.org/drawingml/2006/main" xmlns:pic="http://schemas.openxmlformats.org/drawingml/2006/picture" xmlns:wp="http://schemas.openxmlformats.org/drawingml/2006/wordprocessingDrawing">
+<w:document xmlns:wpc="http://schemas.microsoft.com/office/word/2010/wordprocessingCanvas" xmlns:cx="http://schemas.microsoft.com/office/drawing/2014/chartex" xmlns:cx1="http://schemas.microsoft.com/office/drawing/2015/9/8/chartex" xmlns:cx2="http://schemas.microsoft.com/office/drawing/2015/10/21/chartex" xmlns:cx3="http://schemas.microsoft.com/office/drawing/2016/5/9/chartex" xmlns:cx4="http://schemas.microsoft.com/office/drawing/2016/5/10/chartex" xmlns:cx5="http://schemas.microsoft.com/office/drawing/2016/5/11/chartex" xmlns:cx6="http://schemas.microsoft.com/office/drawing/2016/5/12/chartex" xmlns:cx7="http://schemas.microsoft.com/office/drawing/2016/5/13/chartex" xmlns:cx8="http://schemas.microsoft.com/office/drawing/2016/5/14/chartex" xmlns:mc="http://schemas.openxmlformats.org/markup-compatibility/2006" xmlns:m="http://schemas.openxmlformats.org/officeDocument/2006/math" xmlns:aink="http://schemas.microsoft.com/office/drawing/2016/ink" xmlns:am3d="http://schemas.microsoft.com/office/drawing/2017/model3d" xmlns:oel="http://schemas.microsoft.com/office/2019/extlst" xmlns:r="http://schemas.openxmlformats.org/officeDocument/2006/relationships" xmlns:wp14="http://schemas.microsoft.com/office/word/2010/wordprocessingDrawing" xmlns:wp="http://schemas.openxmlformats.org/drawingml/2006/wordprocessingDrawing" xmlns:wpg="http://schemas.microsoft.com/office/word/2010/wordprocessingGroup" xmlns:wpi="http://schemas.microsoft.com/office/word/2010/wordprocessingInk" xmlns:wps="http://schemas.microsoft.com/office/word/2010/wordprocessingShape" xmlns:o="urn:schemas-microsoft-com:office:office" xmlns:v="urn:schemas-microsoft-com:vml" xmlns:w10="urn:schemas-microsoft-com:office:word" xmlns:w="http://schemas.openxmlformats.org/wordprocessingml/2006/main" xmlns:w14="http://schemas.microsoft.com/office/word/2010/wordml" xmlns:w15="http://schemas.microsoft.com/office/word/2012/wordml" xmlns:w16cex="http://schemas.microsoft.com/office/word/2018/wordml/cex" xmlns:w16cid="http://schemas.microsoft.com/office/word/2016/wordml/cid" xmlns:w16="http://schemas.microsoft.com/office/word/2018/wordml" xmlns:w16sdtdh="http://schemas.microsoft.com/office/word/2020/wordml/sdtdatahash" xmlns:w16sdtfl="http://schemas.microsoft.com/office/word/2024/wordml/sdtformatlock" xmlns:w16se="http://schemas.microsoft.com/office/word/2015/wordml/symex" xmlns:w16du="http://schemas.microsoft.com/office/word/2023/wordml/word16du" xmlns:wne="http://schemas.microsoft.com/office/word/2006/wordml" mc:Ignorable="w14 w15 w16se w16cid w16 w16cex w16sdtdh w16sdtfl w16du wp14">
   <w:body>
-    <w:bookmarkStart w:id="13" w:name="applicant-and-team-capability-to-deliver"/>
     <w:p>
       <w:pPr>
         <w:pStyle w:val="Heading1"/>
       </w:pPr>
-      <w:r>
-        <w:t xml:space="preserve">APPLICANT AND TEAM CAPABILITY TO DELIVER</w:t>
-      </w:r>
-    </w:p>
-    <w:bookmarkStart w:id="9" w:name="X32e351cedb78f5f8a6e0e35a5d9fd9e794cd399"/>
+      <w:bookmarkStart w:id="0" w:name="applicant-and-team-capability-to-deliver"/>
+      <w:r>
+        <w:t>APPLICANT AND TEAM CAPABILITY TO DELIVER</w:t>
+      </w:r>
+    </w:p>
     <w:p>
       <w:pPr>
         <w:pStyle w:val="Heading2"/>
       </w:pPr>
-      <w:r>
-        <w:t xml:space="preserve">Contributions to the Generation of New Ideas, Tools, Methodologies, or Knowledge</w:t>
+      <w:bookmarkStart w:id="1" w:name="X32e351cedb78f5f8a6e0e35a5d9fd9e794cd399"/>
+      <w:r>
+        <w:t>Contributions to the Generation of New Ideas, Tools, Methodologies, or Knowledge</w:t>
       </w:r>
     </w:p>
     <w:p>
@@ -25,7 +25,7 @@
         <w:pStyle w:val="FirstParagraph"/>
       </w:pPr>
       <w:r>
-        <w:t xml:space="preserve">The Project Lead (PL), Dr Rowan Brown, is Senior Lecturer in Biomedical Engineering at Swansea University (MPhys, first class, 2000; PhD, 2004). For more than fifteen years the PL has developed data-driven methods that recover ensemble organisation from individual-agent measurements, from cellular populations and spatial biological networks to competitive multi-agent systems in professional sport. This Small Grant poses the same microstate-to-macrostate question for a 22-player point cloud using multi-scale persistent homology. The PL delivered a 12-month EPSRC First Grant (EP/M000621/1, £96,009) on ensemble behaviour, giving direct precedent for a time-boxed award at this scale.</w:t>
+        <w:t>The Project Lead (PL), Dr Rowan Brown, is Senior Lecturer in Biomedical Engineering at Swansea University (MPhys, first class, 2000; PhD, 2004). For more than fifteen years the PL has developed data-driven methods that recover ensemble organisation from individual-agent measurements, from cellular populations and spatial biological networks to competitive multi-agent systems in professional sport. This Small Grant poses the same microstate-to-macrostate question for a 22-player point cloud using multi-scale persistent homology. The PL delivered a 12-month EPSRC First Grant (EP/M000621/1, £96,009) on ensemble behaviour, giving direct precedent for a time-boxed award at this scale.</w:t>
       </w:r>
     </w:p>
     <w:p>
@@ -37,77 +37,50 @@
           <w:b/>
           <w:bCs/>
         </w:rPr>
-        <w:t xml:space="preserve">Prior funded research (selected).</w:t>
-      </w:r>
-      <w:r>
-        <w:t xml:space="preserve"> </w:t>
-      </w:r>
-      <w:r>
-        <w:t xml:space="preserve">As PI: EPSRC Mobility Fellowship (EP/G037841/1); the First Grant above with GE Healthcare and Professor Tamás Vicsek; rugby head-load measurement (Sports and Wellbeing Analytics / Welsh Government, 2020/21); Swim Wales training-load analytics (2024/25). As Co-I: Office of Naval Research Global hetero-swarm robotics (2021/22); Welsh Institute of Performance Science; English Institute of Sport data-science applications. Investigator work on nanoparticle tracking (EP/H008683/1) and clot-network geometry (EP/L024799/1) established high-volume spatial time-series pipelines. First-author work in</w:t>
-      </w:r>
-      <w:r>
-        <w:t xml:space="preserve"> </w:t>
+        <w:t>Prior funded research (selected).</w:t>
+      </w:r>
+      <w:r>
+        <w:t xml:space="preserve"> As PI: EPSRC Mobility Fellowship (EP/G037841/1); the First Grant above with GE Healthcare and Professor Tamás Vicsek; rugby head-load measurement (Sports and Wellbeing Analytics / Welsh Government, 2020/21); Swim Wales training-load analytics (2024/25). As Co-I: Office of Naval Research Global hetero-swarm robotics (2021/22); Welsh Institute of Performance Science; English Institute of Sport data-science applications. Investigator work on nanoparticle tracking (EP/H008683/1) and clot-network geometry (EP/L024799/1) established high-volume spatial time-series pipelines. First-author work in </w:t>
       </w:r>
       <w:r>
         <w:rPr>
           <w:i/>
           <w:iCs/>
         </w:rPr>
-        <w:t xml:space="preserve">Physica D</w:t>
-      </w:r>
-      <w:r>
-        <w:t xml:space="preserve"> </w:t>
-      </w:r>
-      <w:r>
-        <w:t xml:space="preserve">(2010); collaborative outputs in</w:t>
-      </w:r>
-      <w:r>
-        <w:t xml:space="preserve"> </w:t>
+        <w:t>Physica D</w:t>
+      </w:r>
+      <w:r>
+        <w:t xml:space="preserve"> (2010); collaborative outputs in </w:t>
       </w:r>
       <w:r>
         <w:rPr>
           <w:i/>
           <w:iCs/>
         </w:rPr>
-        <w:t xml:space="preserve">Nature Nanotechnology</w:t>
-      </w:r>
-      <w:r>
-        <w:t xml:space="preserve"> </w:t>
-      </w:r>
-      <w:r>
-        <w:t xml:space="preserve">(2011),</w:t>
-      </w:r>
-      <w:r>
-        <w:t xml:space="preserve"> </w:t>
+        <w:t>Nature Nanotechnology</w:t>
+      </w:r>
+      <w:r>
+        <w:t xml:space="preserve"> (2011), </w:t>
       </w:r>
       <w:r>
         <w:rPr>
           <w:i/>
           <w:iCs/>
         </w:rPr>
-        <w:t xml:space="preserve">Nature Methods</w:t>
-      </w:r>
-      <w:r>
-        <w:t xml:space="preserve"> </w:t>
-      </w:r>
-      <w:r>
-        <w:t xml:space="preserve">(2014) and</w:t>
-      </w:r>
-      <w:r>
-        <w:t xml:space="preserve"> </w:t>
+        <w:t>Nature Methods</w:t>
+      </w:r>
+      <w:r>
+        <w:t xml:space="preserve"> (2014) and </w:t>
       </w:r>
       <w:r>
         <w:rPr>
           <w:i/>
           <w:iCs/>
         </w:rPr>
-        <w:t xml:space="preserve">Nature Communications</w:t>
-      </w:r>
-      <w:r>
-        <w:t xml:space="preserve"> </w:t>
-      </w:r>
-      <w:r>
-        <w:t xml:space="preserve">(2019).</w:t>
+        <w:t>Nature Communications</w:t>
+      </w:r>
+      <w:r>
+        <w:t xml:space="preserve"> (2019).</w:t>
       </w:r>
     </w:p>
     <w:p>
@@ -119,10 +92,10 @@
           <w:b/>
           <w:bCs/>
         </w:rPr>
-        <w:t xml:space="preserve">Most relevant prior outputs (PL)</w:t>
-      </w:r>
-      <w:r>
-        <w:t xml:space="preserve">:</w:t>
+        <w:t>Most relevant prior outputs (PL)</w:t>
+      </w:r>
+      <w:r>
+        <w:t>:</w:t>
       </w:r>
     </w:p>
     <w:p>
@@ -130,27 +103,21 @@
         <w:pStyle w:val="Compact"/>
         <w:numPr>
           <w:ilvl w:val="0"/>
-          <w:numId w:val="1001"/>
+          <w:numId w:val="2"/>
         </w:numPr>
       </w:pPr>
       <w:r>
-        <w:t xml:space="preserve">Brown MR, et al. Flow-based cytometric analysis of cell cycle via simulated cell populations.</w:t>
-      </w:r>
-      <w:r>
-        <w:t xml:space="preserve"> </w:t>
+        <w:t xml:space="preserve">Brown MR, et al. Flow-based cytometric analysis of cell cycle via simulated cell populations. </w:t>
       </w:r>
       <w:r>
         <w:rPr>
           <w:i/>
           <w:iCs/>
         </w:rPr>
-        <w:t xml:space="preserve">PLoS Computational Biology</w:t>
-      </w:r>
-      <w:r>
-        <w:t xml:space="preserve"> </w:t>
-      </w:r>
-      <w:r>
-        <w:t xml:space="preserve">2010 — ensemble models from individual measurements.</w:t>
+        <w:t>PLoS Computational Biology</w:t>
+      </w:r>
+      <w:r>
+        <w:t xml:space="preserve"> 2010 — ensemble models from individual measurements.</w:t>
       </w:r>
     </w:p>
     <w:p>
@@ -158,27 +125,21 @@
         <w:pStyle w:val="Compact"/>
         <w:numPr>
           <w:ilvl w:val="0"/>
-          <w:numId w:val="1001"/>
+          <w:numId w:val="2"/>
         </w:numPr>
       </w:pPr>
       <w:r>
-        <w:t xml:space="preserve">Brown MR, et al. Fractal discrimination of random fractal aggregates and its application in biomarker analysis for blood coagulation.</w:t>
-      </w:r>
-      <w:r>
-        <w:t xml:space="preserve"> </w:t>
+        <w:t xml:space="preserve">Brown MR, et al. Fractal discrimination of random fractal aggregates and its application in biomarker analysis for blood coagulation. </w:t>
       </w:r>
       <w:r>
         <w:rPr>
           <w:i/>
           <w:iCs/>
         </w:rPr>
-        <w:t xml:space="preserve">Chaos, Solitons &amp; Fractals</w:t>
-      </w:r>
-      <w:r>
-        <w:t xml:space="preserve"> </w:t>
-      </w:r>
-      <w:r>
-        <w:t xml:space="preserve">2012 — geometric spatial networks.</w:t>
+        <w:t>Chaos, Solitons &amp; Fractals</w:t>
+      </w:r>
+      <w:r>
+        <w:t xml:space="preserve"> 2012 — geometric spatial networks.</w:t>
       </w:r>
     </w:p>
     <w:p>
@@ -186,11 +147,11 @@
         <w:pStyle w:val="Compact"/>
         <w:numPr>
           <w:ilvl w:val="0"/>
-          <w:numId w:val="1001"/>
+          <w:numId w:val="2"/>
         </w:numPr>
       </w:pPr>
       <w:r>
-        <w:t xml:space="preserve">Brown R, Scott G, Kilduff L. Relative Advantage: quantifying performance in noisy competitive settings. Preprint 2025 — competitive systems as a measurement domain.</w:t>
+        <w:t>Brown R, Scott G, Kilduff L. Relative Advantage: quantifying performance in noisy competitive settings. Preprint 2025 — competitive systems as a measurement domain.</w:t>
       </w:r>
     </w:p>
     <w:p>
@@ -202,23 +163,21 @@
           <w:b/>
           <w:bCs/>
         </w:rPr>
-        <w:t xml:space="preserve">Technical innovations (this programme):</w:t>
-      </w:r>
-      <w:r>
-        <w:t xml:space="preserve"> </w:t>
-      </w:r>
-      <w:r>
-        <w:t xml:space="preserve">measurement-aware clustering for spatial TDA; adaptive multi-scale H1 filtration; closed-cycle H1 realisation; temporal persistence landscapes. The ten-match validation in Vision and Approach is PL-led foundation for this award; code and parameters feed the Month-2 gate. Python implementation (Ripser, GUDHI, giotto-tda) runs at &lt;2 s per frame on Supercomputing Wales; open-source release is planned.</w:t>
-      </w:r>
-    </w:p>
-    <w:bookmarkEnd w:id="9"/>
-    <w:bookmarkStart w:id="10" w:name="X25e3d77ae3827115ef735361f588f6af050200c"/>
+        <w:t>Technical innovations (this programme):</w:t>
+      </w:r>
+      <w:r>
+        <w:t xml:space="preserve"> measurement-aware clustering for spatial TDA; adaptive multi-scale H1 filtration; closed-cycle H1 realisation; temporal persistence landscapes. The ten-match validation in Vision and Approach is PL-led foundation for this award; code and parameters feed the Month-2 gate. Python implementation (Ripser, GUDHI, giotto-tda) runs at &lt;2 s per frame on Supercomputing Wales; open-source release is planned.</w:t>
+      </w:r>
+    </w:p>
     <w:p>
       <w:pPr>
         <w:pStyle w:val="Heading2"/>
       </w:pPr>
-      <w:r>
-        <w:t xml:space="preserve">Development of Others and Maintenance of Effective Working Relationships</w:t>
+      <w:bookmarkStart w:id="2" w:name="X25e3d77ae3827115ef735361f588f6af050200c"/>
+      <w:bookmarkEnd w:id="1"/>
+      <w:r>
+        <w:lastRenderedPageBreak/>
+        <w:t>Development of Others and Maintenance of Effective Working Relationships</w:t>
       </w:r>
     </w:p>
     <w:p>
@@ -230,13 +189,10 @@
           <w:b/>
           <w:bCs/>
         </w:rPr>
-        <w:t xml:space="preserve">Doctoral supervision and partnerships:</w:t>
-      </w:r>
-      <w:r>
-        <w:t xml:space="preserve"> </w:t>
-      </w:r>
-      <w:r>
-        <w:t xml:space="preserve">The PL first-supervises six full-time doctoral students on Championship match-outcome analytics (EPSRC Doctoral Training Partnership with Swansea City AFC, club part-funded), UK Sports Institute (UKSI) analytics, spatiotemporal rugby and football analytics, swimming performance prediction, head-acceleration metrology, and Team INEOS digital twins; and second-supervises responsible AI in government security operations. The EPSRC–SCAFC co-investment is the funded precedent for this grant’s partnership; Declan O’Hara’s Championship match-outcome doctorate is the closest applied sibling to the season-scale topology pipeline. An EPSRC CASE studentship with Ospreys Rugby produced peer-reviewed outputs with club co-authorship. Graduates have moved into elite-sport analytics roles in professional rugby union and Premier League football.</w:t>
+        <w:t>Doctoral supervision and partnerships:</w:t>
+      </w:r>
+      <w:r>
+        <w:t xml:space="preserve"> The PL first-supervises six full-time doctoral students on Championship match-outcome analytics (EPSRC Doctoral Training Partnership with Swansea City AFC, club part-funded), UK Sports Institute (UKSI) analytics, spatiotemporal rugby and football analytics, swimming performance prediction, head-acceleration metrology, and Team INEOS digital twins; and second-supervises responsible AI in government security operations. The EPSRC–SCAFC co-investment is the funded precedent for this grant’s partnership; Declan O’Hara’s Championship match-outcome doctorate is the closest applied sibling to the season-scale topology pipeline. An EPSRC CASE studentship with Ospreys Rugby produced peer-reviewed outputs with club co-authorship. Graduates have moved into elite-sport analytics roles in professional rugby union and Premier League football.</w:t>
       </w:r>
     </w:p>
     <w:p>
@@ -248,13 +204,10 @@
           <w:b/>
           <w:bCs/>
         </w:rPr>
-        <w:t xml:space="preserve">Research Associate (RA) development:</w:t>
-      </w:r>
-      <w:r>
-        <w:t xml:space="preserve"> </w:t>
-      </w:r>
-      <w:r>
-        <w:t xml:space="preserve">The RA (1.0 FTE, Months 5–10) receives training in topological data analysis (TDA), inference under dependence, and scientific programming, with co-authorship, attendance at Algebraic Topology: Methods, Computation and Science (ATMCS 13, Stockholm; post starts 1 July during the meeting), and Standard Grant drafting exposure at Months 9–10. Weekly PL meetings, monthly reviews, and scheduled guidance from Project co-lead (PcL) Dr Nelly Villamizar (Mathematics) cover landscape well-posedness and stability for Objective 2 (O2).</w:t>
+        <w:t>Research Associate (RA) development:</w:t>
+      </w:r>
+      <w:r>
+        <w:t xml:space="preserve"> The RA (1.0 FTE, Months 5–10) receives training in topological data analysis (TDA), inference under dependence, and scientific programming, with co-authorship, attendance at Algebraic Topology: Methods, Computation and Science (ATMCS 13, Stockholm; post starts 1 July during the meeting), and Standard Grant drafting exposure at Months 9–10. Weekly PL meetings, monthly reviews, and scheduled guidance from Project co-lead (PcL) Dr Nelly Villamizar (Mathematics) cover landscape well-posedness and stability for Objective 2 (O2).</w:t>
       </w:r>
     </w:p>
     <w:p>
@@ -266,7 +219,7 @@
           <w:b/>
           <w:bCs/>
         </w:rPr>
-        <w:t xml:space="preserve">RA deliverables (D1–D3):</w:t>
+        <w:t>RA deliverables (D1–D3):</w:t>
       </w:r>
       <w:r>
         <w:t xml:space="preserve"> </w:t>
@@ -276,45 +229,30 @@
           <w:b/>
           <w:bCs/>
         </w:rPr>
-        <w:t xml:space="preserve">D1 (Month 7):</w:t>
-      </w:r>
-      <w:r>
-        <w:t xml:space="preserve"> </w:t>
-      </w:r>
-      <w:r>
-        <w:t xml:space="preserve">reproducible H0 and H1 barcode store for ~540 Championship matches with provenance hashes (O1 gate).</w:t>
-      </w:r>
-      <w:r>
-        <w:t xml:space="preserve"> </w:t>
+        <w:t>D1 (Month 7):</w:t>
+      </w:r>
+      <w:r>
+        <w:t xml:space="preserve"> reproducible H0 and H1 barcode store for ~540 Championship matches with provenance hashes (O1 gate). </w:t>
       </w:r>
       <w:r>
         <w:rPr>
           <w:b/>
           <w:bCs/>
         </w:rPr>
-        <w:t xml:space="preserve">D2 (Month 8):</w:t>
-      </w:r>
-      <w:r>
-        <w:t xml:space="preserve"> </w:t>
-      </w:r>
-      <w:r>
-        <w:t xml:space="preserve">persistence landscapes, Fréchet means, and cumulative sum (CUSUM) module at both scales (O2); comparison-geometry results and T1/T2 statements follow at Month 9 against the Month-2 Open Science Framework (OSF) pre-registration.</w:t>
-      </w:r>
-      <w:r>
-        <w:t xml:space="preserve"> </w:t>
+        <w:t>D2 (Month 8):</w:t>
+      </w:r>
+      <w:r>
+        <w:t xml:space="preserve"> persistence landscapes, Fréchet means, and cumulative sum (CUSUM) module at both scales (O2); comparison-geometry results and T1/T2 statements follow at Month 9 against the Month-2 Open Science Framework (OSF) pre-registration. </w:t>
       </w:r>
       <w:r>
         <w:rPr>
           <w:b/>
           <w:bCs/>
         </w:rPr>
-        <w:t xml:space="preserve">D3 (Month 10):</w:t>
-      </w:r>
-      <w:r>
-        <w:t xml:space="preserve"> </w:t>
-      </w:r>
-      <w:r>
-        <w:t xml:space="preserve">documented pipeline, figures and prose for the season paper and Month-12 Standard Grant evidence pack. Months 1–4 are PL-led (runnable pipeline and Month-2 gate) so D1–D3 are scale-up and proof work, not greenfield design.</w:t>
+        <w:t>D3 (Month 10):</w:t>
+      </w:r>
+      <w:r>
+        <w:t xml:space="preserve"> documented pipeline, figures and prose for the season paper and Month-12 Standard Grant evidence pack. Months 1–4 are PL-led (runnable pipeline and Month-2 gate) so D1–D3 are scale-up and proof work, not greenfield design.</w:t>
       </w:r>
     </w:p>
     <w:p>
@@ -326,13 +264,10 @@
           <w:b/>
           <w:bCs/>
         </w:rPr>
-        <w:t xml:space="preserve">Equality, diversity and inclusion:</w:t>
-      </w:r>
-      <w:r>
-        <w:t xml:space="preserve"> </w:t>
-      </w:r>
-      <w:r>
-        <w:t xml:space="preserve">RA recruitment follows Swansea EDI practice (anonymised shortlisting, diverse panel, outreach via Piscopia, BWM, London Mathematical Society (LMS)).</w:t>
+        <w:t>Equality, diversity and inclusion:</w:t>
+      </w:r>
+      <w:r>
+        <w:t xml:space="preserve"> RA recruitment follows Swansea EDI practice (anonymised shortlisting, diverse panel, outreach via Piscopia, BWM, London Mathematical Society (LMS)).</w:t>
       </w:r>
     </w:p>
     <w:p>
@@ -344,85 +279,92 @@
           <w:b/>
           <w:bCs/>
         </w:rPr>
-        <w:t xml:space="preserve">Resources and delivery (JeS):</w:t>
-      </w:r>
-      <w:r>
-        <w:t xml:space="preserve"> </w:t>
-      </w:r>
-      <w:r>
-        <w:t xml:space="preserve">IPA 799 (16 Oct 2026) staff total £96,918 fEC (£77,534 at 80%), 1 Mar 2027–29 Feb 2028: PL 0.10 FTE and PcL Villamizar 0.05 FTE (12 months); RA 1.0 FTE Months 5–10 (1 Jul–31 Dec 2027). Headroom £3,082 under the £100k fEC cap is reserved for Directly Incurred conference travel (ATMCS 13, Stockholm). Months 1–4 are PL-led; RA spend scales a gated pipeline (D1–D3). Supercomputing Wales and SCAFC–StatsBomb data are in-kind; no equipment.</w:t>
-      </w:r>
-    </w:p>
-    <w:p>
-      <w:pPr>
-        <w:pStyle w:val="BodyText"/>
-      </w:pPr>
+        <w:t>Resources and delivery : staff total £96,918 fEC (£77,534 at 80%), 1 Mar 2027–29 Feb 2028: PL 0.10 FTE and PcL Villamizar 0.05 FTE (12 months); RA 1.0 FTE Months 5–10 (1 Jul–31 Dec 2027). Directly Incurred conference travel for the PL to ATMCS 13 (Stockholm) is costed at £2,150; £932 headroom under the £100k fEC cap is unused. Months 1–4 are PL-led; RA spend scales a gated pipeline (D1–D3). Supercomputing Wales and SCAFC–StatsBomb data are in-kind; no equipment.</w:t>
+      </w:r>
+      <w:proofErr w:type="gramStart"/>
       <w:r>
         <w:rPr>
           <w:b/>
           <w:bCs/>
         </w:rPr>
-        <w:t xml:space="preserve">Collaborative research:</w:t>
-      </w:r>
-      <w:r>
-        <w:t xml:space="preserve"> </w:t>
-      </w:r>
-      <w:r>
-        <w:t xml:space="preserve">Championship club partnerships (UK), Hudl (UK; owns StatsBomb), Borussia Dortmund (Germany, alumni pathway). Collaborators for the follow-on Standard Grant (stability of the shape summary to grouping choices, and one transfer test on a second bounded competitive system) enter on that award, not this one.</w:t>
-      </w:r>
-    </w:p>
-    <w:bookmarkEnd w:id="10"/>
-    <w:bookmarkStart w:id="11" w:name="Xc95dc2617854933ef0a4eb019344fa473ffc344"/>
-    <w:p>
-      <w:pPr>
-        <w:pStyle w:val="Heading2"/>
-      </w:pPr>
-      <w:r>
-        <w:t xml:space="preserve">Contributions to the Wider Research and Innovation Community</w:t>
-      </w:r>
-    </w:p>
-    <w:p>
-      <w:pPr>
-        <w:pStyle w:val="FirstParagraph"/>
+      </w:r>
+      <w:proofErr w:type="gramEnd"/>
+      <w:r/>
+    </w:p>
+    <w:p>
+      <w:pPr>
+        <w:pStyle w:val="BodyText"/>
       </w:pPr>
       <w:r>
         <w:rPr>
           <w:b/>
           <w:bCs/>
         </w:rPr>
-        <w:t xml:space="preserve">Academic and open science:</w:t>
-      </w:r>
-      <w:r>
-        <w:t xml:space="preserve"> </w:t>
-      </w:r>
-      <w:r>
-        <w:t xml:space="preserve">Methodological publications, presentation at ATMCS 13 (KTH Stockholm, June–July 2027), and open-source TDA software. Supervised work includes peer-reviewed rugby analytics (</w:t>
+        <w:t>Collaborative research:</w:t>
+      </w:r>
+      <w:r>
+        <w:t xml:space="preserve"> Championship club partnerships (UK), Hudl (UK; owns StatsBomb), Borussia Dortmund (Germany, alumni pathway). Collaborators for the follow-</w:t>
+      </w:r>
+      <w:r>
+        <w:lastRenderedPageBreak/>
+        <w:t xml:space="preserve">on Standard Grant (stability of the shape summary to grouping choices, and one transfer test on </w:t>
+      </w:r>
+      <w:r>
+        <w:t xml:space="preserve">to </w:t>
+      </w:r>
+      <w:r>
+        <w:t xml:space="preserve">a second </w:t>
+      </w:r>
+      <w:r>
+        <w:t xml:space="preserve">distinct </w:t>
+      </w:r>
+      <w:r>
+        <w:t>bounded competitive system).</w:t>
+      </w:r>
+    </w:p>
+    <w:p>
+      <w:pPr>
+        <w:pStyle w:val="Heading2"/>
+      </w:pPr>
+      <w:bookmarkStart w:id="3" w:name="Xc95dc2617854933ef0a4eb019344fa473ffc344"/>
+      <w:bookmarkEnd w:id="2"/>
+      <w:r>
+        <w:t>Contributions to the Wider Research and Innovation Community</w:t>
+      </w:r>
+    </w:p>
+    <w:p>
+      <w:pPr>
+        <w:pStyle w:val="FirstParagraph"/>
+      </w:pPr>
+      <w:r>
+        <w:rPr>
+          <w:b/>
+          <w:bCs/>
+        </w:rPr>
+        <w:t>Academic and open science:</w:t>
+      </w:r>
+      <w:r>
+        <w:t xml:space="preserve"> Methodological publications, presentation at ATMCS 13 (KTH Stockholm, June–July 2027), and open-source TDA software. Supervised work includes peer-reviewed rugby analytics (</w:t>
       </w:r>
       <w:r>
         <w:rPr>
           <w:i/>
           <w:iCs/>
         </w:rPr>
-        <w:t xml:space="preserve">Journal of Science and Medicine in Sport</w:t>
-      </w:r>
-      <w:r>
-        <w:t xml:space="preserve"> </w:t>
-      </w:r>
-      <w:r>
-        <w:t xml:space="preserve">and</w:t>
-      </w:r>
-      <w:r>
-        <w:t xml:space="preserve"> </w:t>
+        <w:t>Journal of Science and Medicine in Sport</w:t>
+      </w:r>
+      <w:r>
+        <w:t xml:space="preserve"> and </w:t>
       </w:r>
       <w:r>
         <w:rPr>
           <w:i/>
           <w:iCs/>
         </w:rPr>
-        <w:t xml:space="preserve">International Journal of Sports Physiology and Performance</w:t>
-      </w:r>
-      <w:r>
-        <w:t xml:space="preserve">, 2023).</w:t>
+        <w:t>International Journal of Sports Physiology and Performance</w:t>
+      </w:r>
+      <w:r>
+        <w:t>, 2023).</w:t>
       </w:r>
     </w:p>
     <w:p>
@@ -434,13 +376,10 @@
           <w:b/>
           <w:bCs/>
         </w:rPr>
-        <w:t xml:space="preserve">Innovation partnerships:</w:t>
-      </w:r>
-      <w:r>
-        <w:t xml:space="preserve"> </w:t>
-      </w:r>
-      <w:r>
-        <w:t xml:space="preserve">Swansea City AFC, UKSI, Sport Wales (WIPS), Team INEOS, and the hetero-swarm programme evidence multi-agent work beyond football.</w:t>
+        <w:t>Innovation partnerships:</w:t>
+      </w:r>
+      <w:r>
+        <w:t xml:space="preserve"> Swansea City AFC, UKSI, Sport Wales (WIPS), Team INEOS, and the hetero-swarm programme evidence multi-agent work beyond football.</w:t>
       </w:r>
     </w:p>
     <w:p>
@@ -452,23 +391,20 @@
           <w:b/>
           <w:bCs/>
         </w:rPr>
-        <w:t xml:space="preserve">Cross-domain relevance:</w:t>
-      </w:r>
-      <w:r>
-        <w:t xml:space="preserve"> </w:t>
-      </w:r>
-      <w:r>
-        <w:t xml:space="preserve">The lens transfers to other bounded competitive systems once interaction lengths are re-derived. The follow-on Standard Grant tests whether the measured shape survives grouping and distance choices, then repeats those checks in one further setting. Public engagement uses topology visualisations through sport.</w:t>
-      </w:r>
-    </w:p>
-    <w:bookmarkEnd w:id="11"/>
-    <w:bookmarkStart w:id="12" w:name="X60db1665fdeb508261722f70ab294558b25a380"/>
+        <w:t>Cross-domain relevance:</w:t>
+      </w:r>
+      <w:r>
+        <w:t xml:space="preserve"> The lens transfers to other bounded competitive systems once interaction lengths are re-derived. The follow-on Standard Grant tests whether the measured shape survives grouping and distance choices, then repeats those checks in one further setting. Public engagement uses topology visualisations through sport.</w:t>
+      </w:r>
+    </w:p>
     <w:p>
       <w:pPr>
         <w:pStyle w:val="Heading2"/>
       </w:pPr>
-      <w:r>
-        <w:t xml:space="preserve">Contributions to Broader Research or Innovation Users and Towards Wider Societal Benefit</w:t>
+      <w:bookmarkStart w:id="4" w:name="X60db1665fdeb508261722f70ab294558b25a380"/>
+      <w:bookmarkEnd w:id="3"/>
+      <w:r>
+        <w:t>Contributions to Broader Research or Innovation Users and Towards Wider Societal Benefit</w:t>
       </w:r>
     </w:p>
     <w:p>
@@ -480,13 +416,10 @@
           <w:b/>
           <w:bCs/>
         </w:rPr>
-        <w:t xml:space="preserve">Mathematical sciences:</w:t>
-      </w:r>
-      <w:r>
-        <w:t xml:space="preserve"> </w:t>
-      </w:r>
-      <w:r>
-        <w:t xml:space="preserve">Validated multi-scale workflows, efficient season-scale computation, and teaching materials. Hosted in the Zienkiewicz Institute with Supercomputing Wales and secure storage.</w:t>
+        <w:t>Mathematical sciences:</w:t>
+      </w:r>
+      <w:r>
+        <w:t xml:space="preserve"> Validated multi-scale workflows, efficient season-scale computation, and teaching materials. Hosted in the Zienkiewicz Institute with Supercomputing Wales and secure storage.</w:t>
       </w:r>
     </w:p>
     <w:p>
@@ -498,54 +431,32 @@
           <w:b/>
           <w:bCs/>
         </w:rPr>
-        <w:t xml:space="preserve">Broader users and societal benefit:</w:t>
-      </w:r>
-      <w:r>
-        <w:t xml:space="preserve"> </w:t>
-      </w:r>
-      <w:r>
-        <w:t xml:space="preserve">Wider users include organisations seeking coordination metrics in multi-agent settings (robotics, logistics, crowd safety). Societal benefits include safer crowded-space management, sports-analytics economic value, and public inspiration through accessible mathematics. The PL previously translated incipient-clot fractal dimension into a clinically interpretable venous thromboembolism biomarker. That translation is direct precedent for practitioner-facing topological summaries on this award, co-developed with Swansea City AFC and StatsBomb.</w:t>
-      </w:r>
-    </w:p>
-    <w:bookmarkEnd w:id="12"/>
-    <w:bookmarkEnd w:id="13"/>
+        <w:t>Broader users and societal benefit:</w:t>
+      </w:r>
+      <w:r>
+        <w:t xml:space="preserve"> Wider users include organisations seeking coordination metrics in multi-agent settings (robotics, logistics, crowd safety). Societal benefits include safer crowded-space management, sports-analytics economic value, and public inspiration through accessible mathematics. The PL previously translated incipient-clot fractal dimension into a clinically interpretable venous thromboembolism biomarker. That translation is direct precedent for practitioner-facing topological summaries on this award, co-developed with Swansea City AFC and StatsBomb.</w:t>
+      </w:r>
+      <w:bookmarkEnd w:id="0"/>
+      <w:bookmarkEnd w:id="4"/>
+    </w:p>
     <w:sectPr>
       <w:footnotePr>
         <w:numRestart w:val="eachSect"/>
       </w:footnotePr>
+      <w:pgSz w:w="12240" w:h="15840"/>
+      <w:pgMar w:top="1440" w:right="1440" w:bottom="1440" w:left="1440" w:header="720" w:footer="720" w:gutter="0"/>
+      <w:cols w:space="720"/>
     </w:sectPr>
   </w:body>
 </w:document>
 </file>
 
-<file path=word/comments.xml><?xml version="1.0" encoding="utf-8"?>
-<w:comments xmlns:w="http://schemas.openxmlformats.org/wordprocessingml/2006/main" xmlns:m="http://schemas.openxmlformats.org/officeDocument/2006/math" xmlns:r="http://schemas.openxmlformats.org/officeDocument/2006/relationships" xmlns:o="urn:schemas-microsoft-com:office:office" xmlns:v="urn:schemas-microsoft-com:vml" xmlns:w10="urn:schemas-microsoft-com:office:word" xmlns:a="http://schemas.openxmlformats.org/drawingml/2006/main" xmlns:pic="http://schemas.openxmlformats.org/drawingml/2006/picture" xmlns:wp="http://schemas.openxmlformats.org/drawingml/2006/wordprocessingDrawing"/>
-</file>
-
-<file path=word/footnotes.xml><?xml version="1.0" encoding="utf-8"?>
-<w:footnotes xmlns:w="http://schemas.openxmlformats.org/wordprocessingml/2006/main" xmlns:m="http://schemas.openxmlformats.org/officeDocument/2006/math" xmlns:r="http://schemas.openxmlformats.org/officeDocument/2006/relationships" xmlns:o="urn:schemas-microsoft-com:office:office" xmlns:v="urn:schemas-microsoft-com:vml" xmlns:w10="urn:schemas-microsoft-com:office:word" xmlns:a="http://schemas.openxmlformats.org/drawingml/2006/main" xmlns:pic="http://schemas.openxmlformats.org/drawingml/2006/picture" xmlns:wp="http://schemas.openxmlformats.org/drawingml/2006/wordprocessingDrawing">
-  <w:footnote w:type="continuationSeparator" w:id="0">
-    <w:p>
-      <w:r>
-        <w:continuationSeparator/>
-      </w:r>
-    </w:p>
-  </w:footnote>
-  <w:footnote w:type="separator" w:id="-1">
-    <w:p>
-      <w:r>
-        <w:separator/>
-      </w:r>
-    </w:p>
-  </w:footnote>
-</w:footnotes>
-</file>
-
 <file path=word/numbering.xml><?xml version="1.0" encoding="utf-8"?>
-<w:numbering xmlns:w="http://schemas.openxmlformats.org/wordprocessingml/2006/main">
-  <w:abstractNum w:abstractNumId="990">
+<w:numbering xmlns:wpc="http://schemas.microsoft.com/office/word/2010/wordprocessingCanvas" xmlns:cx="http://schemas.microsoft.com/office/drawing/2014/chartex" xmlns:cx1="http://schemas.microsoft.com/office/drawing/2015/9/8/chartex" xmlns:cx2="http://schemas.microsoft.com/office/drawing/2015/10/21/chartex" xmlns:cx3="http://schemas.microsoft.com/office/drawing/2016/5/9/chartex" xmlns:cx4="http://schemas.microsoft.com/office/drawing/2016/5/10/chartex" xmlns:cx5="http://schemas.microsoft.com/office/drawing/2016/5/11/chartex" xmlns:cx6="http://schemas.microsoft.com/office/drawing/2016/5/12/chartex" xmlns:cx7="http://schemas.microsoft.com/office/drawing/2016/5/13/chartex" xmlns:cx8="http://schemas.microsoft.com/office/drawing/2016/5/14/chartex" xmlns:mc="http://schemas.openxmlformats.org/markup-compatibility/2006" xmlns:m="http://schemas.openxmlformats.org/officeDocument/2006/math" xmlns:aink="http://schemas.microsoft.com/office/drawing/2016/ink" xmlns:am3d="http://schemas.microsoft.com/office/drawing/2017/model3d" xmlns:oel="http://schemas.microsoft.com/office/2019/extlst" xmlns:r="http://schemas.openxmlformats.org/officeDocument/2006/relationships" xmlns:wp14="http://schemas.microsoft.com/office/word/2010/wordprocessingDrawing" xmlns:wp="http://schemas.openxmlformats.org/drawingml/2006/wordprocessingDrawing" xmlns:wpg="http://schemas.microsoft.com/office/word/2010/wordprocessingGroup" xmlns:wpi="http://schemas.microsoft.com/office/word/2010/wordprocessingInk" xmlns:wps="http://schemas.microsoft.com/office/word/2010/wordprocessingShape" xmlns:o="urn:schemas-microsoft-com:office:office" xmlns:v="urn:schemas-microsoft-com:vml" xmlns:w10="urn:schemas-microsoft-com:office:word" xmlns:w="http://schemas.openxmlformats.org/wordprocessingml/2006/main" xmlns:w14="http://schemas.microsoft.com/office/word/2010/wordml" xmlns:w15="http://schemas.microsoft.com/office/word/2012/wordml" xmlns:w16cex="http://schemas.microsoft.com/office/word/2018/wordml/cex" xmlns:w16cid="http://schemas.microsoft.com/office/word/2016/wordml/cid" xmlns:w16="http://schemas.microsoft.com/office/word/2018/wordml" xmlns:w16sdtdh="http://schemas.microsoft.com/office/word/2020/wordml/sdtdatahash" xmlns:w16sdtfl="http://schemas.microsoft.com/office/word/2024/wordml/sdtformatlock" xmlns:w16se="http://schemas.microsoft.com/office/word/2015/wordml/symex" xmlns:w16du="http://schemas.microsoft.com/office/word/2023/wordml/word16du" xmlns:wne="http://schemas.microsoft.com/office/word/2006/wordml" mc:Ignorable="w14 w15 w16se w16cid w16 w16cex w16sdtdh w16sdtfl w16du wp14">
+  <w:abstractNum w:abstractNumId="0" w15:restartNumberingAfterBreak="0">
     <w:nsid w:val="0000A990"/>
     <w:multiLevelType w:val="multilevel"/>
+    <w:tmpl w:val="78C8EC58"/>
     <w:lvl w:ilvl="0">
       <w:numFmt w:val="bullet"/>
       <w:lvlText w:val=" "/>
@@ -619,9 +530,10 @@
       </w:pPr>
     </w:lvl>
   </w:abstractNum>
-  <w:abstractNum w:abstractNumId="99411">
+  <w:abstractNum w:abstractNumId="1" w15:restartNumberingAfterBreak="0">
     <w:nsid w:val="00A99411"/>
     <w:multiLevelType w:val="multilevel"/>
+    <w:tmpl w:val="62AA8DA0"/>
     <w:lvl w:ilvl="0">
       <w:start w:val="1"/>
       <w:numFmt w:val="decimal"/>
@@ -704,11 +616,11 @@
       </w:pPr>
     </w:lvl>
   </w:abstractNum>
-  <w:num w:numId="1000">
-    <w:abstractNumId w:val="990"/>
+  <w:num w:numId="1" w16cid:durableId="855312910">
+    <w:abstractNumId w:val="0"/>
   </w:num>
-  <w:num w:numId="1001">
-    <w:abstractNumId w:val="99411"/>
+  <w:num w:numId="2" w16cid:durableId="1304655653">
+    <w:abstractNumId w:val="1"/>
     <w:lvlOverride w:ilvl="0">
       <w:startOverride w:val="1"/>
     </w:lvlOverride>
@@ -741,14 +653,14 @@
 </file>
 
 <file path=word/styles.xml><?xml version="1.0" encoding="utf-8"?>
-<w:styles xmlns:r="http://schemas.openxmlformats.org/officeDocument/2006/relationships" xmlns:w="http://schemas.openxmlformats.org/wordprocessingml/2006/main">
+<w:styles xmlns:mc="http://schemas.openxmlformats.org/markup-compatibility/2006" xmlns:r="http://schemas.openxmlformats.org/officeDocument/2006/relationships" xmlns:w="http://schemas.openxmlformats.org/wordprocessingml/2006/main" xmlns:w14="http://schemas.microsoft.com/office/word/2010/wordml" xmlns:w15="http://schemas.microsoft.com/office/word/2012/wordml" xmlns:w16cex="http://schemas.microsoft.com/office/word/2018/wordml/cex" xmlns:w16cid="http://schemas.microsoft.com/office/word/2016/wordml/cid" xmlns:w16="http://schemas.microsoft.com/office/word/2018/wordml" xmlns:w16sdtdh="http://schemas.microsoft.com/office/word/2020/wordml/sdtdatahash" xmlns:w16sdtfl="http://schemas.microsoft.com/office/word/2024/wordml/sdtformatlock" xmlns:w16se="http://schemas.microsoft.com/office/word/2015/wordml/symex" xmlns:w16du="http://schemas.microsoft.com/office/word/2023/wordml/word16du" mc:Ignorable="w14 w15 w16se w16cid w16 w16cex w16sdtdh w16sdtfl w16du">
   <w:docDefaults>
     <w:rPrDefault>
       <w:rPr>
-        <w:rFonts w:asciiTheme="minorHAnsi" w:cstheme="minorBidi" w:eastAsiaTheme="minorEastAsia" w:hAnsiTheme="minorHAnsi"/>
+        <w:rFonts w:asciiTheme="minorHAnsi" w:eastAsiaTheme="minorEastAsia" w:hAnsiTheme="minorHAnsi" w:cstheme="minorBidi"/>
         <w:sz w:val="24"/>
         <w:szCs w:val="24"/>
-        <w:lang w:bidi="ar-SA" w:eastAsia="zh-CN" w:val="en-US"/>
+        <w:lang w:val="en-US" w:eastAsia="zh-CN" w:bidi="ar-SA"/>
       </w:rPr>
     </w:rPrDefault>
     <w:pPrDefault>
@@ -757,168 +669,255 @@
       </w:pPr>
     </w:pPrDefault>
   </w:docDefaults>
-  <w:latentStyles w:count="276" w:defLockedState="0" w:defQFormat="0" w:defSemiHidden="0" w:defUIPriority="0" w:defUnhideWhenUsed="0"/>
-  <w:style w:default="1" w:styleId="Normal" w:type="paragraph">
+  <w:latentStyles w:defLockedState="0" w:defUIPriority="0" w:defSemiHidden="0" w:defUnhideWhenUsed="0" w:defQFormat="0" w:count="376">
+    <w:lsdException w:name="Normal Table" w:semiHidden="1" w:unhideWhenUsed="1"/>
+    <w:lsdException w:name="Table Simple 1" w:semiHidden="1" w:unhideWhenUsed="1"/>
+    <w:lsdException w:name="Table Simple 2" w:semiHidden="1" w:unhideWhenUsed="1"/>
+    <w:lsdException w:name="Table Simple 3" w:semiHidden="1" w:unhideWhenUsed="1"/>
+    <w:lsdException w:name="Table Classic 1" w:semiHidden="1" w:unhideWhenUsed="1"/>
+    <w:lsdException w:name="Table Classic 2" w:semiHidden="1" w:unhideWhenUsed="1"/>
+    <w:lsdException w:name="Table Classic 3" w:semiHidden="1" w:unhideWhenUsed="1"/>
+    <w:lsdException w:name="Table Classic 4" w:semiHidden="1" w:unhideWhenUsed="1"/>
+    <w:lsdException w:name="Table Colorful 1" w:semiHidden="1" w:unhideWhenUsed="1"/>
+    <w:lsdException w:name="Table Colorful 2" w:semiHidden="1" w:unhideWhenUsed="1"/>
+    <w:lsdException w:name="Table Colorful 3" w:semiHidden="1" w:unhideWhenUsed="1"/>
+    <w:lsdException w:name="Table Columns 1" w:semiHidden="1" w:unhideWhenUsed="1"/>
+    <w:lsdException w:name="Table Columns 2" w:semiHidden="1" w:unhideWhenUsed="1"/>
+    <w:lsdException w:name="Table Columns 3" w:semiHidden="1" w:unhideWhenUsed="1"/>
+    <w:lsdException w:name="Table Columns 4" w:semiHidden="1" w:unhideWhenUsed="1"/>
+    <w:lsdException w:name="Table Columns 5" w:semiHidden="1" w:unhideWhenUsed="1"/>
+    <w:lsdException w:name="Table Grid 1" w:semiHidden="1" w:unhideWhenUsed="1"/>
+    <w:lsdException w:name="Table Grid 2" w:semiHidden="1" w:unhideWhenUsed="1"/>
+    <w:lsdException w:name="Table Grid 3" w:semiHidden="1" w:unhideWhenUsed="1"/>
+    <w:lsdException w:name="Table Grid 4" w:semiHidden="1" w:unhideWhenUsed="1"/>
+    <w:lsdException w:name="Table Grid 5" w:semiHidden="1" w:unhideWhenUsed="1"/>
+    <w:lsdException w:name="Table Grid 6" w:semiHidden="1" w:unhideWhenUsed="1"/>
+    <w:lsdException w:name="Table Grid 7" w:semiHidden="1" w:unhideWhenUsed="1"/>
+    <w:lsdException w:name="Table Grid 8" w:semiHidden="1" w:unhideWhenUsed="1"/>
+    <w:lsdException w:name="Table List 1" w:semiHidden="1" w:unhideWhenUsed="1"/>
+    <w:lsdException w:name="Table List 2" w:semiHidden="1" w:unhideWhenUsed="1"/>
+    <w:lsdException w:name="Table List 3" w:semiHidden="1" w:unhideWhenUsed="1"/>
+    <w:lsdException w:name="Table List 4" w:semiHidden="1" w:unhideWhenUsed="1"/>
+    <w:lsdException w:name="Table List 5" w:semiHidden="1" w:unhideWhenUsed="1"/>
+    <w:lsdException w:name="Table List 6" w:semiHidden="1" w:unhideWhenUsed="1"/>
+    <w:lsdException w:name="Table List 7" w:semiHidden="1" w:unhideWhenUsed="1"/>
+    <w:lsdException w:name="Table List 8" w:semiHidden="1" w:unhideWhenUsed="1"/>
+    <w:lsdException w:name="Table 3D effects 1" w:semiHidden="1" w:unhideWhenUsed="1"/>
+    <w:lsdException w:name="Table 3D effects 2" w:semiHidden="1" w:unhideWhenUsed="1"/>
+    <w:lsdException w:name="Table 3D effects 3" w:semiHidden="1" w:unhideWhenUsed="1"/>
+    <w:lsdException w:name="Table Contemporary" w:semiHidden="1" w:unhideWhenUsed="1"/>
+    <w:lsdException w:name="Table Elegant" w:semiHidden="1" w:unhideWhenUsed="1"/>
+    <w:lsdException w:name="Table Professional" w:semiHidden="1" w:unhideWhenUsed="1"/>
+    <w:lsdException w:name="Table Subtle 1" w:semiHidden="1" w:unhideWhenUsed="1"/>
+    <w:lsdException w:name="Table Subtle 2" w:semiHidden="1" w:unhideWhenUsed="1"/>
+    <w:lsdException w:name="Table Web 1" w:semiHidden="1" w:unhideWhenUsed="1"/>
+    <w:lsdException w:name="Table Web 2" w:semiHidden="1" w:unhideWhenUsed="1"/>
+    <w:lsdException w:name="Table Web 3" w:semiHidden="1" w:unhideWhenUsed="1"/>
+    <w:lsdException w:name="Table Theme" w:semiHidden="1" w:unhideWhenUsed="1"/>
+    <w:lsdException w:name="Light Shading"/>
+    <w:lsdException w:name="Light List"/>
+    <w:lsdException w:name="Light Grid"/>
+    <w:lsdException w:name="Medium Shading 1"/>
+    <w:lsdException w:name="Medium Shading 2"/>
+    <w:lsdException w:name="Medium List 1"/>
+    <w:lsdException w:name="Medium List 2"/>
+    <w:lsdException w:name="Medium Grid 1"/>
+    <w:lsdException w:name="Medium Grid 2"/>
+    <w:lsdException w:name="Medium Grid 3"/>
+    <w:lsdException w:name="Dark List"/>
+    <w:lsdException w:name="Colorful Shading"/>
+    <w:lsdException w:name="Colorful List"/>
+    <w:lsdException w:name="Colorful Grid"/>
+    <w:lsdException w:name="Light Shading Accent 1"/>
+    <w:lsdException w:name="Light List Accent 1"/>
+    <w:lsdException w:name="Light Grid Accent 1"/>
+    <w:lsdException w:name="Medium Shading 1 Accent 1"/>
+    <w:lsdException w:name="Medium Shading 2 Accent 1"/>
+    <w:lsdException w:name="Medium List 1 Accent 1"/>
+    <w:lsdException w:name="Medium List 2 Accent 1"/>
+    <w:lsdException w:name="Medium Grid 1 Accent 1"/>
+    <w:lsdException w:name="Medium Grid 2 Accent 1"/>
+    <w:lsdException w:name="Medium Grid 3 Accent 1"/>
+    <w:lsdException w:name="Dark List Accent 1"/>
+    <w:lsdException w:name="Colorful Shading Accent 1"/>
+    <w:lsdException w:name="Colorful List Accent 1"/>
+    <w:lsdException w:name="Colorful Grid Accent 1"/>
+    <w:lsdException w:name="Light Shading Accent 2"/>
+    <w:lsdException w:name="Light List Accent 2"/>
+    <w:lsdException w:name="Light Grid Accent 2"/>
+    <w:lsdException w:name="Medium Shading 1 Accent 2"/>
+    <w:lsdException w:name="Medium Shading 2 Accent 2"/>
+    <w:lsdException w:name="Medium List 1 Accent 2"/>
+    <w:lsdException w:name="Medium List 2 Accent 2"/>
+    <w:lsdException w:name="Medium Grid 1 Accent 2"/>
+    <w:lsdException w:name="Medium Grid 2 Accent 2"/>
+    <w:lsdException w:name="Medium Grid 3 Accent 2"/>
+    <w:lsdException w:name="Dark List Accent 2"/>
+    <w:lsdException w:name="Colorful Shading Accent 2"/>
+    <w:lsdException w:name="Colorful List Accent 2"/>
+    <w:lsdException w:name="Colorful Grid Accent 2"/>
+    <w:lsdException w:name="Light Shading Accent 3"/>
+    <w:lsdException w:name="Light List Accent 3"/>
+    <w:lsdException w:name="Light Grid Accent 3"/>
+    <w:lsdException w:name="Medium Shading 1 Accent 3"/>
+    <w:lsdException w:name="Medium Shading 2 Accent 3"/>
+    <w:lsdException w:name="Medium List 1 Accent 3"/>
+    <w:lsdException w:name="Medium List 2 Accent 3"/>
+    <w:lsdException w:name="Medium Grid 1 Accent 3"/>
+    <w:lsdException w:name="Medium Grid 2 Accent 3"/>
+    <w:lsdException w:name="Medium Grid 3 Accent 3"/>
+    <w:lsdException w:name="Dark List Accent 3"/>
+    <w:lsdException w:name="Colorful Shading Accent 3"/>
+    <w:lsdException w:name="Colorful List Accent 3"/>
+    <w:lsdException w:name="Colorful Grid Accent 3"/>
+    <w:lsdException w:name="Light Shading Accent 4"/>
+    <w:lsdException w:name="Light List Accent 4"/>
+    <w:lsdException w:name="Light Grid Accent 4"/>
+    <w:lsdException w:name="Medium Shading 1 Accent 4"/>
+    <w:lsdException w:name="Medium Shading 2 Accent 4"/>
+    <w:lsdException w:name="Medium List 1 Accent 4"/>
+    <w:lsdException w:name="Medium List 2 Accent 4"/>
+    <w:lsdException w:name="Medium Grid 1 Accent 4"/>
+    <w:lsdException w:name="Medium Grid 2 Accent 4"/>
+    <w:lsdException w:name="Medium Grid 3 Accent 4"/>
+    <w:lsdException w:name="Dark List Accent 4"/>
+    <w:lsdException w:name="Colorful Shading Accent 4"/>
+    <w:lsdException w:name="Colorful List Accent 4"/>
+    <w:lsdException w:name="Colorful Grid Accent 4"/>
+    <w:lsdException w:name="Light Shading Accent 5"/>
+    <w:lsdException w:name="Light List Accent 5"/>
+    <w:lsdException w:name="Light Grid Accent 5"/>
+    <w:lsdException w:name="Medium Shading 1 Accent 5"/>
+    <w:lsdException w:name="Medium Shading 2 Accent 5"/>
+    <w:lsdException w:name="Medium List 1 Accent 5"/>
+    <w:lsdException w:name="Medium List 2 Accent 5"/>
+    <w:lsdException w:name="Medium Grid 1 Accent 5"/>
+    <w:lsdException w:name="Medium Grid 2 Accent 5"/>
+    <w:lsdException w:name="Medium Grid 3 Accent 5"/>
+    <w:lsdException w:name="Dark List Accent 5"/>
+    <w:lsdException w:name="Colorful Shading Accent 5"/>
+    <w:lsdException w:name="Colorful List Accent 5"/>
+    <w:lsdException w:name="Colorful Grid Accent 5"/>
+    <w:lsdException w:name="Light Shading Accent 6"/>
+    <w:lsdException w:name="Light List Accent 6"/>
+    <w:lsdException w:name="Light Grid Accent 6"/>
+    <w:lsdException w:name="Medium Shading 1 Accent 6"/>
+    <w:lsdException w:name="Medium Shading 2 Accent 6"/>
+    <w:lsdException w:name="Medium List 1 Accent 6"/>
+    <w:lsdException w:name="Medium List 2 Accent 6"/>
+    <w:lsdException w:name="Medium Grid 1 Accent 6"/>
+    <w:lsdException w:name="Medium Grid 2 Accent 6"/>
+    <w:lsdException w:name="Medium Grid 3 Accent 6"/>
+    <w:lsdException w:name="Dark List Accent 6"/>
+    <w:lsdException w:name="Colorful Shading Accent 6"/>
+    <w:lsdException w:name="Colorful List Accent 6"/>
+    <w:lsdException w:name="Colorful Grid Accent 6"/>
+    <w:lsdException w:name="Grid Table 4" w:uiPriority="49"/>
+    <w:lsdException w:name="Grid Table 5 Dark" w:uiPriority="50"/>
+    <w:lsdException w:name="Grid Table 6 Colorful" w:uiPriority="51"/>
+    <w:lsdException w:name="Grid Table 7 Colorful" w:uiPriority="52"/>
+    <w:lsdException w:name="Grid Table 1 Light Accent 1" w:uiPriority="46"/>
+    <w:lsdException w:name="Grid Table 2 Accent 1" w:uiPriority="47"/>
+    <w:lsdException w:name="Grid Table 3 Accent 1" w:uiPriority="48"/>
+    <w:lsdException w:name="Grid Table 4 Accent 1" w:uiPriority="49"/>
+    <w:lsdException w:name="Grid Table 5 Dark Accent 1" w:uiPriority="50"/>
+    <w:lsdException w:name="Grid Table 6 Colorful Accent 1" w:uiPriority="51"/>
+    <w:lsdException w:name="Grid Table 7 Colorful Accent 1" w:uiPriority="52"/>
+    <w:lsdException w:name="Grid Table 1 Light Accent 2" w:uiPriority="46"/>
+    <w:lsdException w:name="Grid Table 2 Accent 2" w:uiPriority="47"/>
+    <w:lsdException w:name="Grid Table 3 Accent 2" w:uiPriority="48"/>
+    <w:lsdException w:name="Grid Table 4 Accent 2" w:uiPriority="49"/>
+    <w:lsdException w:name="Grid Table 5 Dark Accent 2" w:uiPriority="50"/>
+    <w:lsdException w:name="Grid Table 6 Colorful Accent 2" w:uiPriority="51"/>
+    <w:lsdException w:name="Grid Table 7 Colorful Accent 2" w:uiPriority="52"/>
+    <w:lsdException w:name="Grid Table 1 Light Accent 3" w:uiPriority="46"/>
+    <w:lsdException w:name="Grid Table 2 Accent 3" w:uiPriority="47"/>
+    <w:lsdException w:name="Grid Table 3 Accent 3" w:uiPriority="48"/>
+    <w:lsdException w:name="Grid Table 4 Accent 3" w:uiPriority="49"/>
+    <w:lsdException w:name="Grid Table 5 Dark Accent 3" w:uiPriority="50"/>
+    <w:lsdException w:name="Grid Table 6 Colorful Accent 3" w:uiPriority="51"/>
+    <w:lsdException w:name="Grid Table 7 Colorful Accent 3" w:uiPriority="52"/>
+    <w:lsdException w:name="Grid Table 1 Light Accent 4" w:uiPriority="46"/>
+    <w:lsdException w:name="Grid Table 2 Accent 4" w:uiPriority="47"/>
+    <w:lsdException w:name="Grid Table 3 Accent 4" w:uiPriority="48"/>
+    <w:lsdException w:name="Grid Table 4 Accent 4" w:uiPriority="49"/>
+    <w:lsdException w:name="Grid Table 5 Dark Accent 4" w:uiPriority="50"/>
+    <w:lsdException w:name="Grid Table 6 Colorful Accent 4" w:uiPriority="51"/>
+    <w:lsdException w:name="Grid Table 7 Colorful Accent 4" w:uiPriority="52"/>
+    <w:lsdException w:name="Grid Table 1 Light Accent 5" w:uiPriority="46"/>
+    <w:lsdException w:name="Grid Table 2 Accent 5" w:uiPriority="47"/>
+    <w:lsdException w:name="Grid Table 3 Accent 5" w:uiPriority="48"/>
+    <w:lsdException w:name="Grid Table 4 Accent 5" w:uiPriority="49"/>
+    <w:lsdException w:name="Grid Table 5 Dark Accent 5" w:uiPriority="50"/>
+    <w:lsdException w:name="Grid Table 6 Colorful Accent 5" w:uiPriority="51"/>
+    <w:lsdException w:name="Grid Table 7 Colorful Accent 5" w:uiPriority="52"/>
+    <w:lsdException w:name="Grid Table 1 Light Accent 6" w:uiPriority="46"/>
+    <w:lsdException w:name="Grid Table 2 Accent 6" w:uiPriority="47"/>
+    <w:lsdException w:name="Grid Table 3 Accent 6" w:uiPriority="48"/>
+    <w:lsdException w:name="Grid Table 4 Accent 6" w:uiPriority="49"/>
+    <w:lsdException w:name="Grid Table 5 Dark Accent 6" w:uiPriority="50"/>
+    <w:lsdException w:name="Grid Table 6 Colorful Accent 6" w:uiPriority="51"/>
+    <w:lsdException w:name="Grid Table 7 Colorful Accent 6" w:uiPriority="52"/>
+    <w:lsdException w:name="List Table 1 Light" w:uiPriority="46"/>
+    <w:lsdException w:name="List Table 2" w:uiPriority="47"/>
+    <w:lsdException w:name="List Table 3" w:uiPriority="48"/>
+    <w:lsdException w:name="List Table 4" w:uiPriority="49"/>
+    <w:lsdException w:name="List Table 5 Dark" w:uiPriority="50"/>
+    <w:lsdException w:name="List Table 6 Colorful" w:uiPriority="51"/>
+    <w:lsdException w:name="List Table 7 Colorful" w:uiPriority="52"/>
+    <w:lsdException w:name="List Table 1 Light Accent 1" w:uiPriority="46"/>
+    <w:lsdException w:name="List Table 2 Accent 1" w:uiPriority="47"/>
+    <w:lsdException w:name="List Table 3 Accent 1" w:uiPriority="48"/>
+    <w:lsdException w:name="List Table 4 Accent 1" w:uiPriority="49"/>
+    <w:lsdException w:name="List Table 5 Dark Accent 1" w:uiPriority="50"/>
+    <w:lsdException w:name="List Table 6 Colorful Accent 1" w:uiPriority="51"/>
+    <w:lsdException w:name="List Table 7 Colorful Accent 1" w:uiPriority="52"/>
+    <w:lsdException w:name="List Table 1 Light Accent 2" w:uiPriority="46"/>
+    <w:lsdException w:name="List Table 2 Accent 2" w:uiPriority="47"/>
+    <w:lsdException w:name="List Table 3 Accent 2" w:uiPriority="48"/>
+    <w:lsdException w:name="List Table 4 Accent 2" w:uiPriority="49"/>
+    <w:lsdException w:name="List Table 5 Dark Accent 2" w:uiPriority="50"/>
+    <w:lsdException w:name="List Table 6 Colorful Accent 2" w:uiPriority="51"/>
+    <w:lsdException w:name="List Table 7 Colorful Accent 2" w:uiPriority="52"/>
+    <w:lsdException w:name="List Table 1 Light Accent 3" w:uiPriority="46"/>
+    <w:lsdException w:name="List Table 2 Accent 3" w:uiPriority="47"/>
+    <w:lsdException w:name="List Table 3 Accent 3" w:uiPriority="48"/>
+    <w:lsdException w:name="List Table 4 Accent 3" w:uiPriority="49"/>
+    <w:lsdException w:name="List Table 5 Dark Accent 3" w:uiPriority="50"/>
+    <w:lsdException w:name="List Table 6 Colorful Accent 3" w:uiPriority="51"/>
+    <w:lsdException w:name="List Table 7 Colorful Accent 3" w:uiPriority="52"/>
+    <w:lsdException w:name="List Table 1 Light Accent 4" w:uiPriority="46"/>
+    <w:lsdException w:name="List Table 2 Accent 4" w:uiPriority="47"/>
+    <w:lsdException w:name="List Table 3 Accent 4" w:uiPriority="48"/>
+    <w:lsdException w:name="List Table 4 Accent 4" w:uiPriority="49"/>
+    <w:lsdException w:name="List Table 5 Dark Accent 4" w:uiPriority="50"/>
+    <w:lsdException w:name="List Table 6 Colorful Accent 4" w:uiPriority="51"/>
+    <w:lsdException w:name="List Table 7 Colorful Accent 4" w:uiPriority="52"/>
+    <w:lsdException w:name="List Table 1 Light Accent 5" w:uiPriority="46"/>
+    <w:lsdException w:name="List Table 2 Accent 5" w:uiPriority="47"/>
+    <w:lsdException w:name="List Table 3 Accent 5" w:uiPriority="48"/>
+    <w:lsdException w:name="List Table 4 Accent 5" w:uiPriority="49"/>
+    <w:lsdException w:name="List Table 5 Dark Accent 5" w:uiPriority="50"/>
+    <w:lsdException w:name="List Table 6 Colorful Accent 5" w:uiPriority="51"/>
+    <w:lsdException w:name="List Table 7 Colorful Accent 5" w:uiPriority="52"/>
+    <w:lsdException w:name="List Table 1 Light Accent 6" w:uiPriority="46"/>
+    <w:lsdException w:name="List Table 2 Accent 6" w:uiPriority="47"/>
+    <w:lsdException w:name="List Table 3 Accent 6" w:uiPriority="48"/>
+    <w:lsdException w:name="List Table 4 Accent 6" w:uiPriority="49"/>
+    <w:lsdException w:name="List Table 5 Dark Accent 6" w:uiPriority="50"/>
+    <w:lsdException w:name="List Table 6 Colorful Accent 6" w:uiPriority="51"/>
+    <w:lsdException w:name="List Table 7 Colorful Accent 6" w:uiPriority="52"/>
+    <w:lsdException w:name="Mention" w:semiHidden="1" w:uiPriority="99" w:unhideWhenUsed="1"/>
+    <w:lsdException w:name="Smart Hyperlink" w:semiHidden="1" w:uiPriority="99" w:unhideWhenUsed="1"/>
+    <w:lsdException w:name="Hashtag" w:semiHidden="1" w:uiPriority="99" w:unhideWhenUsed="1"/>
+    <w:lsdException w:name="Unresolved Mention" w:semiHidden="1" w:uiPriority="99" w:unhideWhenUsed="1"/>
+    <w:lsdException w:name="Smart Link" w:semiHidden="1" w:uiPriority="99" w:unhideWhenUsed="1"/>
+  </w:latentStyles>
+  <w:style w:type="paragraph" w:default="1" w:styleId="Normal">
     <w:name w:val="Normal"/>
     <w:qFormat/>
   </w:style>
-  <w:style w:styleId="BodyText" w:type="paragraph">
-    <w:name w:val="Body Text"/>
-    <w:basedOn w:val="Normal"/>
-    <w:link w:val="BodyTextChar"/>
-    <w:qFormat/>
-    <w:pPr>
-      <w:spacing w:after="180" w:before="180"/>
-    </w:pPr>
-  </w:style>
-  <w:style w:customStyle="1" w:styleId="FirstParagraph" w:type="paragraph">
-    <w:name w:val="First Paragraph"/>
-    <w:basedOn w:val="BodyText"/>
-    <w:next w:val="BodyText"/>
-    <w:qFormat/>
-  </w:style>
-  <w:style w:customStyle="1" w:styleId="Compact" w:type="paragraph">
-    <w:name w:val="Compact"/>
-    <w:basedOn w:val="BodyText"/>
-    <w:qFormat/>
-    <w:pPr>
-      <w:spacing w:after="36" w:before="36"/>
-    </w:pPr>
-  </w:style>
-  <w:style w:styleId="Title" w:type="paragraph">
-    <w:name w:val="Title"/>
-    <w:basedOn w:val="Normal"/>
-    <w:next w:val="BodyText"/>
-    <w:link w:val="TitleChar"/>
-    <w:uiPriority w:val="10"/>
-    <w:qFormat/>
-    <w:rsid w:val="00A10FD9"/>
-    <w:pPr>
-      <w:spacing w:after="80" w:line="240" w:lineRule="auto"/>
-      <w:contextualSpacing/>
-      <w:jc w:val="center"/>
-    </w:pPr>
-    <w:rPr>
-      <w:rFonts w:asciiTheme="majorHAnsi" w:cstheme="majorBidi" w:eastAsiaTheme="majorEastAsia" w:hAnsiTheme="majorHAnsi"/>
-      <w:sz w:val="56"/>
-      <w:szCs w:val="56"/>
-    </w:rPr>
-  </w:style>
-  <w:style w:customStyle="1" w:styleId="TitleChar" w:type="character">
-    <w:name w:val="Title Char"/>
-    <w:basedOn w:val="DefaultParagraphFont"/>
-    <w:link w:val="Title"/>
-    <w:uiPriority w:val="10"/>
-    <w:rsid w:val="00A10FD9"/>
-    <w:rPr>
-      <w:rFonts w:asciiTheme="majorHAnsi" w:cstheme="majorBidi" w:eastAsiaTheme="majorEastAsia" w:hAnsiTheme="majorHAnsi"/>
-      <w:sz w:val="56"/>
-      <w:szCs w:val="56"/>
-    </w:rPr>
-  </w:style>
-  <w:style w:styleId="Subtitle" w:type="paragraph">
-    <w:name w:val="Subtitle"/>
-    <w:basedOn w:val="Title"/>
-    <w:next w:val="BodyText"/>
-    <w:link w:val="SubtitleChar"/>
-    <w:uiPriority w:val="11"/>
-    <w:qFormat/>
-    <w:rsid w:val="00A10FD9"/>
-    <w:pPr>
-      <w:numPr>
-        <w:ilvl w:val="1"/>
-      </w:numPr>
-    </w:pPr>
-    <w:rPr>
-      <w:rFonts w:cstheme="majorBidi" w:eastAsiaTheme="majorEastAsia"/>
-      <w:spacing w:val="15"/>
-      <w:sz w:val="28"/>
-      <w:szCs w:val="28"/>
-    </w:rPr>
-  </w:style>
-  <w:style w:customStyle="1" w:styleId="SubtitleChar" w:type="character">
-    <w:name w:val="Subtitle Char"/>
-    <w:basedOn w:val="DefaultParagraphFont"/>
-    <w:link w:val="Subtitle"/>
-    <w:uiPriority w:val="11"/>
-    <w:rsid w:val="00A10FD9"/>
-    <w:rPr>
-      <w:rFonts w:cstheme="majorBidi" w:eastAsiaTheme="majorEastAsia"/>
-      <w:color w:themeColor="text1" w:themeTint="A6" w:val="595959"/>
-      <w:spacing w:val="15"/>
-      <w:sz w:val="28"/>
-      <w:szCs w:val="28"/>
-    </w:rPr>
-  </w:style>
-  <w:style w:customStyle="1" w:styleId="Author" w:type="paragraph">
-    <w:name w:val="Author"/>
-    <w:basedOn w:val="Title"/>
-    <w:next w:val="BodyText"/>
-    <w:qFormat/>
-    <w:pPr>
-      <w:keepNext/>
-      <w:keepLines/>
-    </w:pPr>
-    <w:rPr>
-      <w:sz w:val="24"/>
-      <w:szCs w:val="24"/>
-    </w:rPr>
-  </w:style>
-  <w:style w:styleId="Date" w:type="paragraph">
-    <w:name w:val="Date"/>
-    <w:basedOn w:val="Title"/>
-    <w:next w:val="BodyText"/>
-    <w:qFormat/>
-    <w:pPr>
-      <w:keepNext/>
-      <w:keepLines/>
-    </w:pPr>
-    <w:rPr>
-      <w:sz w:val="24"/>
-      <w:szCs w:val="24"/>
-    </w:rPr>
-  </w:style>
-  <w:style w:customStyle="1" w:styleId="AbstractTitle" w:type="paragraph">
-    <w:name w:val="Abstract Title"/>
-    <w:basedOn w:val="Normal"/>
-    <w:next w:val="Abstract"/>
-    <w:qFormat/>
-    <w:pPr>
-      <w:keepNext/>
-      <w:keepLines/>
-      <w:spacing w:after="0" w:before="300"/>
-      <w:jc w:val="center"/>
-    </w:pPr>
-    <w:rPr>
-      <w:b/>
-      <w:sz w:val="20"/>
-      <w:szCs w:val="20"/>
-    </w:rPr>
-  </w:style>
-  <w:style w:customStyle="1" w:styleId="Abstract" w:type="paragraph">
-    <w:name w:val="Abstract"/>
-    <w:basedOn w:val="Normal"/>
-    <w:next w:val="BodyText"/>
-    <w:qFormat/>
-    <w:pPr>
-      <w:keepNext/>
-      <w:keepLines/>
-      <w:spacing w:after="300" w:before="100"/>
-    </w:pPr>
-    <w:rPr>
-      <w:sz w:val="20"/>
-      <w:szCs w:val="20"/>
-    </w:rPr>
-  </w:style>
-  <w:style w:styleId="Bibliography" w:type="paragraph">
-    <w:name w:val="Bibliography"/>
-    <w:basedOn w:val="Normal"/>
-    <w:next w:val="Bibliography"/>
-    <w:qFormat/>
-    <w:pPr/>
-    <w:rPr/>
-  </w:style>
-  <w:style w:styleId="Heading1" w:type="paragraph">
+  <w:style w:type="paragraph" w:styleId="Heading1">
     <w:name w:val="heading 1"/>
     <w:basedOn w:val="Normal"/>
     <w:next w:val="BodyText"/>
@@ -929,17 +928,17 @@
     <w:pPr>
       <w:keepNext/>
       <w:keepLines/>
-      <w:spacing w:after="80" w:before="360"/>
+      <w:spacing w:before="360" w:after="80"/>
       <w:outlineLvl w:val="0"/>
     </w:pPr>
     <w:rPr>
-      <w:rFonts w:asciiTheme="majorHAnsi" w:cstheme="majorBidi" w:eastAsiaTheme="majorEastAsia" w:hAnsiTheme="majorHAnsi"/>
-      <w:color w:themeColor="accent1" w:themeShade="BF" w:val="0F4761"/>
+      <w:rFonts w:asciiTheme="majorHAnsi" w:eastAsiaTheme="majorEastAsia" w:hAnsiTheme="majorHAnsi" w:cstheme="majorBidi"/>
+      <w:color w:val="0F4761" w:themeColor="accent1" w:themeShade="BF"/>
       <w:sz w:val="40"/>
       <w:szCs w:val="40"/>
     </w:rPr>
   </w:style>
-  <w:style w:styleId="Heading2" w:type="paragraph">
+  <w:style w:type="paragraph" w:styleId="Heading2">
     <w:name w:val="heading 2"/>
     <w:basedOn w:val="Normal"/>
     <w:next w:val="BodyText"/>
@@ -952,17 +951,17 @@
     <w:pPr>
       <w:keepNext/>
       <w:keepLines/>
-      <w:spacing w:after="80" w:before="160"/>
+      <w:spacing w:before="160" w:after="80"/>
       <w:outlineLvl w:val="1"/>
     </w:pPr>
     <w:rPr>
-      <w:rFonts w:asciiTheme="majorHAnsi" w:cstheme="majorBidi" w:eastAsiaTheme="majorEastAsia" w:hAnsiTheme="majorHAnsi"/>
-      <w:color w:themeColor="accent1" w:themeShade="BF" w:val="0F4761"/>
+      <w:rFonts w:asciiTheme="majorHAnsi" w:eastAsiaTheme="majorEastAsia" w:hAnsiTheme="majorHAnsi" w:cstheme="majorBidi"/>
+      <w:color w:val="0F4761" w:themeColor="accent1" w:themeShade="BF"/>
       <w:sz w:val="32"/>
       <w:szCs w:val="32"/>
     </w:rPr>
   </w:style>
-  <w:style w:styleId="Heading3" w:type="paragraph">
+  <w:style w:type="paragraph" w:styleId="Heading3">
     <w:name w:val="heading 3"/>
     <w:basedOn w:val="Normal"/>
     <w:next w:val="BodyText"/>
@@ -975,17 +974,17 @@
     <w:pPr>
       <w:keepNext/>
       <w:keepLines/>
-      <w:spacing w:after="80" w:before="160"/>
+      <w:spacing w:before="160" w:after="80"/>
       <w:outlineLvl w:val="2"/>
     </w:pPr>
     <w:rPr>
-      <w:rFonts w:cstheme="majorBidi" w:eastAsiaTheme="majorEastAsia"/>
-      <w:color w:themeColor="accent1" w:themeShade="BF" w:val="0F4761"/>
+      <w:rFonts w:eastAsiaTheme="majorEastAsia" w:cstheme="majorBidi"/>
+      <w:color w:val="0F4761" w:themeColor="accent1" w:themeShade="BF"/>
       <w:sz w:val="28"/>
       <w:szCs w:val="28"/>
     </w:rPr>
   </w:style>
-  <w:style w:styleId="Heading4" w:type="paragraph">
+  <w:style w:type="paragraph" w:styleId="Heading4">
     <w:name w:val="heading 4"/>
     <w:basedOn w:val="Normal"/>
     <w:next w:val="BodyText"/>
@@ -998,17 +997,17 @@
     <w:pPr>
       <w:keepNext/>
       <w:keepLines/>
-      <w:spacing w:after="40" w:before="80"/>
+      <w:spacing w:before="80" w:after="40"/>
       <w:outlineLvl w:val="3"/>
     </w:pPr>
     <w:rPr>
-      <w:rFonts w:cstheme="majorBidi" w:eastAsiaTheme="majorEastAsia"/>
+      <w:rFonts w:eastAsiaTheme="majorEastAsia" w:cstheme="majorBidi"/>
       <w:i/>
       <w:iCs/>
-      <w:color w:themeColor="accent1" w:themeShade="BF" w:val="0F4761"/>
-    </w:rPr>
-  </w:style>
-  <w:style w:styleId="Heading5" w:type="paragraph">
+      <w:color w:val="0F4761" w:themeColor="accent1" w:themeShade="BF"/>
+    </w:rPr>
+  </w:style>
+  <w:style w:type="paragraph" w:styleId="Heading5">
     <w:name w:val="heading 5"/>
     <w:basedOn w:val="Normal"/>
     <w:next w:val="BodyText"/>
@@ -1021,15 +1020,15 @@
     <w:pPr>
       <w:keepNext/>
       <w:keepLines/>
-      <w:spacing w:after="40" w:before="80"/>
+      <w:spacing w:before="80" w:after="40"/>
       <w:outlineLvl w:val="4"/>
     </w:pPr>
     <w:rPr>
-      <w:rFonts w:cstheme="majorBidi" w:eastAsiaTheme="majorEastAsia"/>
-      <w:color w:themeColor="accent1" w:themeShade="BF" w:val="0F4761"/>
-    </w:rPr>
-  </w:style>
-  <w:style w:styleId="Heading6" w:type="paragraph">
+      <w:rFonts w:eastAsiaTheme="majorEastAsia" w:cstheme="majorBidi"/>
+      <w:color w:val="0F4761" w:themeColor="accent1" w:themeShade="BF"/>
+    </w:rPr>
+  </w:style>
+  <w:style w:type="paragraph" w:styleId="Heading6">
     <w:name w:val="heading 6"/>
     <w:basedOn w:val="Normal"/>
     <w:next w:val="BodyText"/>
@@ -1042,17 +1041,17 @@
     <w:pPr>
       <w:keepNext/>
       <w:keepLines/>
-      <w:spacing w:after="0" w:before="40"/>
+      <w:spacing w:before="40" w:after="0"/>
       <w:outlineLvl w:val="5"/>
     </w:pPr>
     <w:rPr>
-      <w:rFonts w:cstheme="majorBidi" w:eastAsiaTheme="majorEastAsia"/>
+      <w:rFonts w:eastAsiaTheme="majorEastAsia" w:cstheme="majorBidi"/>
       <w:i/>
       <w:iCs/>
-      <w:color w:themeColor="text1" w:themeTint="A6" w:val="595959"/>
-    </w:rPr>
-  </w:style>
-  <w:style w:styleId="Heading7" w:type="paragraph">
+      <w:color w:val="595959" w:themeColor="text1" w:themeTint="A6"/>
+    </w:rPr>
+  </w:style>
+  <w:style w:type="paragraph" w:styleId="Heading7">
     <w:name w:val="heading 7"/>
     <w:basedOn w:val="Normal"/>
     <w:next w:val="BodyText"/>
@@ -1065,15 +1064,15 @@
     <w:pPr>
       <w:keepNext/>
       <w:keepLines/>
-      <w:spacing w:after="0" w:before="40"/>
+      <w:spacing w:before="40" w:after="0"/>
       <w:outlineLvl w:val="6"/>
     </w:pPr>
     <w:rPr>
-      <w:rFonts w:cstheme="majorBidi" w:eastAsiaTheme="majorEastAsia"/>
-      <w:color w:themeColor="text1" w:themeTint="A6" w:val="595959"/>
-    </w:rPr>
-  </w:style>
-  <w:style w:styleId="Heading8" w:type="paragraph">
+      <w:rFonts w:eastAsiaTheme="majorEastAsia" w:cstheme="majorBidi"/>
+      <w:color w:val="595959" w:themeColor="text1" w:themeTint="A6"/>
+    </w:rPr>
+  </w:style>
+  <w:style w:type="paragraph" w:styleId="Heading8">
     <w:name w:val="heading 8"/>
     <w:basedOn w:val="Normal"/>
     <w:next w:val="BodyText"/>
@@ -1090,13 +1089,13 @@
       <w:outlineLvl w:val="7"/>
     </w:pPr>
     <w:rPr>
-      <w:rFonts w:cstheme="majorBidi" w:eastAsiaTheme="majorEastAsia"/>
+      <w:rFonts w:eastAsiaTheme="majorEastAsia" w:cstheme="majorBidi"/>
       <w:i/>
       <w:iCs/>
-      <w:color w:themeColor="text1" w:themeTint="D8" w:val="272727"/>
-    </w:rPr>
-  </w:style>
-  <w:style w:styleId="Heading9" w:type="paragraph">
+      <w:color w:val="272727" w:themeColor="text1" w:themeTint="D8"/>
+    </w:rPr>
+  </w:style>
+  <w:style w:type="paragraph" w:styleId="Heading9">
     <w:name w:val="heading 9"/>
     <w:basedOn w:val="Normal"/>
     <w:next w:val="BodyText"/>
@@ -1113,24 +1112,202 @@
       <w:outlineLvl w:val="8"/>
     </w:pPr>
     <w:rPr>
-      <w:rFonts w:cstheme="majorBidi" w:eastAsiaTheme="majorEastAsia"/>
-      <w:color w:themeColor="text1" w:themeTint="D8" w:val="272727"/>
-    </w:rPr>
-  </w:style>
-  <w:style w:customStyle="1" w:styleId="Heading1Char" w:type="character">
+      <w:rFonts w:eastAsiaTheme="majorEastAsia" w:cstheme="majorBidi"/>
+      <w:color w:val="272727" w:themeColor="text1" w:themeTint="D8"/>
+    </w:rPr>
+  </w:style>
+  <w:style w:type="character" w:default="1" w:styleId="DefaultParagraphFont">
+    <w:name w:val="Default Paragraph Font"/>
+    <w:uiPriority w:val="1"/>
+    <w:semiHidden/>
+    <w:unhideWhenUsed/>
+  </w:style>
+  <w:style w:type="table" w:default="1" w:styleId="TableNormal">
+    <w:name w:val="Normal Table"/>
+    <w:uiPriority w:val="99"/>
+    <w:semiHidden/>
+    <w:unhideWhenUsed/>
+    <w:tblPr>
+      <w:tblInd w:w="0" w:type="dxa"/>
+      <w:tblCellMar>
+        <w:top w:w="0" w:type="dxa"/>
+        <w:left w:w="108" w:type="dxa"/>
+        <w:bottom w:w="0" w:type="dxa"/>
+        <w:right w:w="108" w:type="dxa"/>
+      </w:tblCellMar>
+    </w:tblPr>
+  </w:style>
+  <w:style w:type="numbering" w:default="1" w:styleId="NoList">
+    <w:name w:val="No List"/>
+    <w:uiPriority w:val="99"/>
+    <w:semiHidden/>
+    <w:unhideWhenUsed/>
+  </w:style>
+  <w:style w:type="paragraph" w:styleId="BodyText">
+    <w:name w:val="Body Text"/>
+    <w:basedOn w:val="Normal"/>
+    <w:qFormat/>
+    <w:pPr>
+      <w:spacing w:before="180" w:after="180"/>
+    </w:pPr>
+  </w:style>
+  <w:style w:type="paragraph" w:customStyle="1" w:styleId="FirstParagraph">
+    <w:name w:val="First Paragraph"/>
+    <w:basedOn w:val="BodyText"/>
+    <w:next w:val="BodyText"/>
+    <w:qFormat/>
+  </w:style>
+  <w:style w:type="paragraph" w:customStyle="1" w:styleId="Compact">
+    <w:name w:val="Compact"/>
+    <w:basedOn w:val="BodyText"/>
+    <w:qFormat/>
+    <w:pPr>
+      <w:spacing w:before="36" w:after="36"/>
+    </w:pPr>
+  </w:style>
+  <w:style w:type="paragraph" w:styleId="Title">
+    <w:name w:val="Title"/>
+    <w:basedOn w:val="Normal"/>
+    <w:next w:val="BodyText"/>
+    <w:link w:val="TitleChar"/>
+    <w:uiPriority w:val="10"/>
+    <w:qFormat/>
+    <w:rsid w:val="00A10FD9"/>
+    <w:pPr>
+      <w:spacing w:after="80"/>
+      <w:contextualSpacing/>
+      <w:jc w:val="center"/>
+    </w:pPr>
+    <w:rPr>
+      <w:rFonts w:asciiTheme="majorHAnsi" w:eastAsiaTheme="majorEastAsia" w:hAnsiTheme="majorHAnsi" w:cstheme="majorBidi"/>
+      <w:sz w:val="56"/>
+      <w:szCs w:val="56"/>
+    </w:rPr>
+  </w:style>
+  <w:style w:type="character" w:customStyle="1" w:styleId="TitleChar">
+    <w:name w:val="Title Char"/>
+    <w:basedOn w:val="DefaultParagraphFont"/>
+    <w:link w:val="Title"/>
+    <w:uiPriority w:val="10"/>
+    <w:rsid w:val="00A10FD9"/>
+    <w:rPr>
+      <w:rFonts w:asciiTheme="majorHAnsi" w:eastAsiaTheme="majorEastAsia" w:hAnsiTheme="majorHAnsi" w:cstheme="majorBidi"/>
+      <w:sz w:val="56"/>
+      <w:szCs w:val="56"/>
+    </w:rPr>
+  </w:style>
+  <w:style w:type="paragraph" w:styleId="Subtitle">
+    <w:name w:val="Subtitle"/>
+    <w:basedOn w:val="Title"/>
+    <w:next w:val="BodyText"/>
+    <w:link w:val="SubtitleChar"/>
+    <w:uiPriority w:val="11"/>
+    <w:qFormat/>
+    <w:rsid w:val="00A10FD9"/>
+    <w:pPr>
+      <w:numPr>
+        <w:ilvl w:val="1"/>
+      </w:numPr>
+    </w:pPr>
+    <w:rPr>
+      <w:spacing w:val="15"/>
+      <w:sz w:val="28"/>
+      <w:szCs w:val="28"/>
+    </w:rPr>
+  </w:style>
+  <w:style w:type="character" w:customStyle="1" w:styleId="SubtitleChar">
+    <w:name w:val="Subtitle Char"/>
+    <w:basedOn w:val="DefaultParagraphFont"/>
+    <w:link w:val="Subtitle"/>
+    <w:uiPriority w:val="11"/>
+    <w:rsid w:val="00A10FD9"/>
+    <w:rPr>
+      <w:rFonts w:eastAsiaTheme="majorEastAsia" w:cstheme="majorBidi"/>
+      <w:color w:val="595959" w:themeColor="text1" w:themeTint="A6"/>
+      <w:spacing w:val="15"/>
+      <w:sz w:val="28"/>
+      <w:szCs w:val="28"/>
+    </w:rPr>
+  </w:style>
+  <w:style w:type="paragraph" w:customStyle="1" w:styleId="Author">
+    <w:name w:val="Author"/>
+    <w:basedOn w:val="Title"/>
+    <w:next w:val="BodyText"/>
+    <w:qFormat/>
+    <w:pPr>
+      <w:keepNext/>
+      <w:keepLines/>
+    </w:pPr>
+    <w:rPr>
+      <w:sz w:val="24"/>
+      <w:szCs w:val="24"/>
+    </w:rPr>
+  </w:style>
+  <w:style w:type="paragraph" w:styleId="Date">
+    <w:name w:val="Date"/>
+    <w:basedOn w:val="Title"/>
+    <w:next w:val="BodyText"/>
+    <w:qFormat/>
+    <w:pPr>
+      <w:keepNext/>
+      <w:keepLines/>
+    </w:pPr>
+    <w:rPr>
+      <w:sz w:val="24"/>
+      <w:szCs w:val="24"/>
+    </w:rPr>
+  </w:style>
+  <w:style w:type="paragraph" w:customStyle="1" w:styleId="AbstractTitle">
+    <w:name w:val="Abstract Title"/>
+    <w:basedOn w:val="Normal"/>
+    <w:next w:val="Abstract"/>
+    <w:qFormat/>
+    <w:pPr>
+      <w:keepNext/>
+      <w:keepLines/>
+      <w:spacing w:before="300" w:after="0"/>
+      <w:jc w:val="center"/>
+    </w:pPr>
+    <w:rPr>
+      <w:b/>
+      <w:sz w:val="20"/>
+      <w:szCs w:val="20"/>
+    </w:rPr>
+  </w:style>
+  <w:style w:type="paragraph" w:customStyle="1" w:styleId="Abstract">
+    <w:name w:val="Abstract"/>
+    <w:basedOn w:val="Normal"/>
+    <w:next w:val="BodyText"/>
+    <w:qFormat/>
+    <w:pPr>
+      <w:keepNext/>
+      <w:keepLines/>
+      <w:spacing w:before="100" w:after="300"/>
+    </w:pPr>
+    <w:rPr>
+      <w:sz w:val="20"/>
+      <w:szCs w:val="20"/>
+    </w:rPr>
+  </w:style>
+  <w:style w:type="paragraph" w:styleId="Bibliography">
+    <w:name w:val="Bibliography"/>
+    <w:basedOn w:val="Normal"/>
+    <w:qFormat/>
+  </w:style>
+  <w:style w:type="character" w:customStyle="1" w:styleId="Heading1Char">
     <w:name w:val="Heading 1 Char"/>
     <w:basedOn w:val="DefaultParagraphFont"/>
     <w:link w:val="Heading1"/>
     <w:uiPriority w:val="9"/>
     <w:rsid w:val="00A10FD9"/>
     <w:rPr>
-      <w:rFonts w:asciiTheme="majorHAnsi" w:cstheme="majorBidi" w:eastAsiaTheme="majorEastAsia" w:hAnsiTheme="majorHAnsi"/>
-      <w:color w:themeColor="accent1" w:themeShade="BF" w:val="0F4761"/>
+      <w:rFonts w:asciiTheme="majorHAnsi" w:eastAsiaTheme="majorEastAsia" w:hAnsiTheme="majorHAnsi" w:cstheme="majorBidi"/>
+      <w:color w:val="0F4761" w:themeColor="accent1" w:themeShade="BF"/>
       <w:sz w:val="40"/>
       <w:szCs w:val="40"/>
     </w:rPr>
   </w:style>
-  <w:style w:customStyle="1" w:styleId="Heading2Char" w:type="character">
+  <w:style w:type="character" w:customStyle="1" w:styleId="Heading2Char">
     <w:name w:val="Heading 2 Char"/>
     <w:basedOn w:val="DefaultParagraphFont"/>
     <w:link w:val="Heading2"/>
@@ -1138,13 +1315,13 @@
     <w:semiHidden/>
     <w:rsid w:val="00A10FD9"/>
     <w:rPr>
-      <w:rFonts w:asciiTheme="majorHAnsi" w:cstheme="majorBidi" w:eastAsiaTheme="majorEastAsia" w:hAnsiTheme="majorHAnsi"/>
-      <w:color w:themeColor="accent1" w:themeShade="BF" w:val="0F4761"/>
+      <w:rFonts w:asciiTheme="majorHAnsi" w:eastAsiaTheme="majorEastAsia" w:hAnsiTheme="majorHAnsi" w:cstheme="majorBidi"/>
+      <w:color w:val="0F4761" w:themeColor="accent1" w:themeShade="BF"/>
       <w:sz w:val="32"/>
       <w:szCs w:val="32"/>
     </w:rPr>
   </w:style>
-  <w:style w:customStyle="1" w:styleId="Heading3Char" w:type="character">
+  <w:style w:type="character" w:customStyle="1" w:styleId="Heading3Char">
     <w:name w:val="Heading 3 Char"/>
     <w:basedOn w:val="DefaultParagraphFont"/>
     <w:link w:val="Heading3"/>
@@ -1152,13 +1329,13 @@
     <w:semiHidden/>
     <w:rsid w:val="00A10FD9"/>
     <w:rPr>
-      <w:rFonts w:cstheme="majorBidi" w:eastAsiaTheme="majorEastAsia"/>
-      <w:color w:themeColor="accent1" w:themeShade="BF" w:val="0F4761"/>
+      <w:rFonts w:eastAsiaTheme="majorEastAsia" w:cstheme="majorBidi"/>
+      <w:color w:val="0F4761" w:themeColor="accent1" w:themeShade="BF"/>
       <w:sz w:val="28"/>
       <w:szCs w:val="28"/>
     </w:rPr>
   </w:style>
-  <w:style w:customStyle="1" w:styleId="Heading4Char" w:type="character">
+  <w:style w:type="character" w:customStyle="1" w:styleId="Heading4Char">
     <w:name w:val="Heading 4 Char"/>
     <w:basedOn w:val="DefaultParagraphFont"/>
     <w:link w:val="Heading4"/>
@@ -1166,13 +1343,13 @@
     <w:semiHidden/>
     <w:rsid w:val="00A10FD9"/>
     <w:rPr>
-      <w:rFonts w:cstheme="majorBidi" w:eastAsiaTheme="majorEastAsia"/>
+      <w:rFonts w:eastAsiaTheme="majorEastAsia" w:cstheme="majorBidi"/>
       <w:i/>
       <w:iCs/>
-      <w:color w:themeColor="accent1" w:themeShade="BF" w:val="0F4761"/>
-    </w:rPr>
-  </w:style>
-  <w:style w:customStyle="1" w:styleId="Heading5Char" w:type="character">
+      <w:color w:val="0F4761" w:themeColor="accent1" w:themeShade="BF"/>
+    </w:rPr>
+  </w:style>
+  <w:style w:type="character" w:customStyle="1" w:styleId="Heading5Char">
     <w:name w:val="Heading 5 Char"/>
     <w:basedOn w:val="DefaultParagraphFont"/>
     <w:link w:val="Heading5"/>
@@ -1180,11 +1357,11 @@
     <w:semiHidden/>
     <w:rsid w:val="00A10FD9"/>
     <w:rPr>
-      <w:rFonts w:cstheme="majorBidi" w:eastAsiaTheme="majorEastAsia"/>
-      <w:color w:themeColor="accent1" w:themeShade="BF" w:val="0F4761"/>
-    </w:rPr>
-  </w:style>
-  <w:style w:customStyle="1" w:styleId="Heading6Char" w:type="character">
+      <w:rFonts w:eastAsiaTheme="majorEastAsia" w:cstheme="majorBidi"/>
+      <w:color w:val="0F4761" w:themeColor="accent1" w:themeShade="BF"/>
+    </w:rPr>
+  </w:style>
+  <w:style w:type="character" w:customStyle="1" w:styleId="Heading6Char">
     <w:name w:val="Heading 6 Char"/>
     <w:basedOn w:val="DefaultParagraphFont"/>
     <w:link w:val="Heading6"/>
@@ -1192,13 +1369,13 @@
     <w:semiHidden/>
     <w:rsid w:val="00A10FD9"/>
     <w:rPr>
-      <w:rFonts w:cstheme="majorBidi" w:eastAsiaTheme="majorEastAsia"/>
+      <w:rFonts w:eastAsiaTheme="majorEastAsia" w:cstheme="majorBidi"/>
       <w:i/>
       <w:iCs/>
-      <w:color w:themeColor="text1" w:themeTint="A6" w:val="595959"/>
-    </w:rPr>
-  </w:style>
-  <w:style w:customStyle="1" w:styleId="Heading7Char" w:type="character">
+      <w:color w:val="595959" w:themeColor="text1" w:themeTint="A6"/>
+    </w:rPr>
+  </w:style>
+  <w:style w:type="character" w:customStyle="1" w:styleId="Heading7Char">
     <w:name w:val="Heading 7 Char"/>
     <w:basedOn w:val="DefaultParagraphFont"/>
     <w:link w:val="Heading7"/>
@@ -1206,11 +1383,11 @@
     <w:semiHidden/>
     <w:rsid w:val="00A10FD9"/>
     <w:rPr>
-      <w:rFonts w:cstheme="majorBidi" w:eastAsiaTheme="majorEastAsia"/>
-      <w:color w:themeColor="text1" w:themeTint="A6" w:val="595959"/>
-    </w:rPr>
-  </w:style>
-  <w:style w:customStyle="1" w:styleId="Heading8Char" w:type="character">
+      <w:rFonts w:eastAsiaTheme="majorEastAsia" w:cstheme="majorBidi"/>
+      <w:color w:val="595959" w:themeColor="text1" w:themeTint="A6"/>
+    </w:rPr>
+  </w:style>
+  <w:style w:type="character" w:customStyle="1" w:styleId="Heading8Char">
     <w:name w:val="Heading 8 Char"/>
     <w:basedOn w:val="DefaultParagraphFont"/>
     <w:link w:val="Heading8"/>
@@ -1218,13 +1395,13 @@
     <w:semiHidden/>
     <w:rsid w:val="00A10FD9"/>
     <w:rPr>
-      <w:rFonts w:cstheme="majorBidi" w:eastAsiaTheme="majorEastAsia"/>
+      <w:rFonts w:eastAsiaTheme="majorEastAsia" w:cstheme="majorBidi"/>
       <w:i/>
       <w:iCs/>
-      <w:color w:themeColor="text1" w:themeTint="D8" w:val="272727"/>
-    </w:rPr>
-  </w:style>
-  <w:style w:customStyle="1" w:styleId="Heading9Char" w:type="character">
+      <w:color w:val="272727" w:themeColor="text1" w:themeTint="D8"/>
+    </w:rPr>
+  </w:style>
+  <w:style w:type="character" w:customStyle="1" w:styleId="Heading9Char">
     <w:name w:val="Heading 9 Char"/>
     <w:basedOn w:val="DefaultParagraphFont"/>
     <w:link w:val="Heading9"/>
@@ -1232,11 +1409,11 @@
     <w:semiHidden/>
     <w:rsid w:val="00A10FD9"/>
     <w:rPr>
-      <w:rFonts w:cstheme="majorBidi" w:eastAsiaTheme="majorEastAsia"/>
-      <w:color w:themeColor="text1" w:themeTint="D8" w:val="272727"/>
-    </w:rPr>
-  </w:style>
-  <w:style w:styleId="BlockText" w:type="paragraph">
+      <w:rFonts w:eastAsiaTheme="majorEastAsia" w:cstheme="majorBidi"/>
+      <w:color w:val="272727" w:themeColor="text1" w:themeTint="D8"/>
+    </w:rPr>
+  </w:style>
+  <w:style w:type="paragraph" w:styleId="BlockText">
     <w:name w:val="Block Text"/>
     <w:basedOn w:val="BodyText"/>
     <w:next w:val="BodyText"/>
@@ -1244,19 +1421,18 @@
     <w:unhideWhenUsed/>
     <w:qFormat/>
     <w:pPr>
-      <w:spacing w:after="100" w:before="100"/>
-      <w:ind w:firstLine="0" w:left="480" w:right="480"/>
-    </w:pPr>
-  </w:style>
-  <w:style w:styleId="FootnoteText" w:type="paragraph">
-    <w:name w:val="Footnote Text"/>
+      <w:spacing w:before="100" w:after="100"/>
+      <w:ind w:left="480" w:right="480"/>
+    </w:pPr>
+  </w:style>
+  <w:style w:type="paragraph" w:styleId="FootnoteText">
+    <w:name w:val="footnote text"/>
     <w:basedOn w:val="Normal"/>
-    <w:next w:val="FootnoteText"/>
     <w:uiPriority w:val="9"/>
     <w:unhideWhenUsed/>
     <w:qFormat/>
   </w:style>
-  <w:style w:styleId="FootnoteBlockText" w:type="paragraph">
+  <w:style w:type="paragraph" w:customStyle="1" w:styleId="FootnoteBlockText">
     <w:name w:val="Footnote Block Text"/>
     <w:basedOn w:val="FootnoteText"/>
     <w:next w:val="FootnoteText"/>
@@ -1264,40 +1440,35 @@
     <w:unhideWhenUsed/>
     <w:qFormat/>
     <w:pPr>
-      <w:spacing w:after="100" w:before="100"/>
-      <w:ind w:firstLine="0" w:left="480" w:right="480"/>
-    </w:pPr>
-  </w:style>
-  <w:style w:default="1" w:styleId="DefaultParagraphFont" w:type="character">
-    <w:name w:val="Default Paragraph Font"/>
+      <w:spacing w:before="100" w:after="100"/>
+      <w:ind w:left="480" w:right="480"/>
+    </w:pPr>
+  </w:style>
+  <w:style w:type="table" w:customStyle="1" w:styleId="Table">
+    <w:name w:val="Table"/>
     <w:semiHidden/>
     <w:unhideWhenUsed/>
-  </w:style>
-  <w:style w:default="1" w:styleId="Table" w:type="table">
-    <w:name w:val="Table"/>
-    <w:basedOn w:val="TableNormal"/>
-    <w:semiHidden/>
-    <w:unhideWhenUsed/>
     <w:qFormat/>
     <w:tblPr>
-      <w:tblInd w:type="dxa" w:w="0"/>
+      <w:tblInd w:w="0" w:type="dxa"/>
       <w:tblCellMar>
-        <w:top w:type="dxa" w:w="0"/>
-        <w:left w:type="dxa" w:w="108"/>
-        <w:bottom w:type="dxa" w:w="0"/>
-        <w:right w:type="dxa" w:w="108"/>
+        <w:top w:w="0" w:type="dxa"/>
+        <w:left w:w="108" w:type="dxa"/>
+        <w:bottom w:w="0" w:type="dxa"/>
+        <w:right w:w="108" w:type="dxa"/>
       </w:tblCellMar>
     </w:tblPr>
     <w:tblStylePr w:type="firstRow">
+      <w:tblPr/>
       <w:tcPr>
         <w:tcBorders>
-          <w:bottom w:val="single"/>
+          <w:bottom w:val="single" w:sz="0" w:space="0" w:color="auto"/>
         </w:tcBorders>
         <w:vAlign w:val="bottom"/>
       </w:tcPr>
     </w:tblStylePr>
   </w:style>
-  <w:style w:customStyle="1" w:styleId="DefinitionTerm" w:type="paragraph">
+  <w:style w:type="paragraph" w:customStyle="1" w:styleId="DefinitionTerm">
     <w:name w:val="Definition Term"/>
     <w:basedOn w:val="Normal"/>
     <w:next w:val="Definition"/>
@@ -1310,75 +1481,76 @@
       <w:b/>
     </w:rPr>
   </w:style>
-  <w:style w:customStyle="1" w:styleId="Definition" w:type="paragraph">
+  <w:style w:type="paragraph" w:customStyle="1" w:styleId="Definition">
     <w:name w:val="Definition"/>
     <w:basedOn w:val="Normal"/>
   </w:style>
-  <w:style w:styleId="Caption" w:type="paragraph">
-    <w:name w:val="Caption"/>
+  <w:style w:type="paragraph" w:styleId="Caption">
+    <w:name w:val="caption"/>
     <w:basedOn w:val="Normal"/>
-    <w:link w:val="BodyTextChar"/>
-    <w:pPr>
-      <w:spacing w:after="120" w:before="0"/>
+    <w:link w:val="CaptionChar"/>
+    <w:pPr>
+      <w:spacing w:after="120"/>
     </w:pPr>
     <w:rPr>
       <w:i/>
     </w:rPr>
   </w:style>
-  <w:style w:customStyle="1" w:styleId="TableCaption" w:type="paragraph">
+  <w:style w:type="paragraph" w:customStyle="1" w:styleId="TableCaption">
     <w:name w:val="Table Caption"/>
     <w:basedOn w:val="Caption"/>
     <w:pPr>
       <w:keepNext/>
     </w:pPr>
   </w:style>
-  <w:style w:customStyle="1" w:styleId="ImageCaption" w:type="paragraph">
+  <w:style w:type="paragraph" w:customStyle="1" w:styleId="ImageCaption">
     <w:name w:val="Image Caption"/>
     <w:basedOn w:val="Caption"/>
   </w:style>
-  <w:style w:customStyle="1" w:styleId="Figure" w:type="paragraph">
+  <w:style w:type="paragraph" w:customStyle="1" w:styleId="Figure">
     <w:name w:val="Figure"/>
     <w:basedOn w:val="Normal"/>
   </w:style>
-  <w:style w:customStyle="1" w:styleId="CaptionedFigure" w:type="paragraph">
+  <w:style w:type="paragraph" w:customStyle="1" w:styleId="CaptionedFigure">
     <w:name w:val="Captioned Figure"/>
     <w:basedOn w:val="Figure"/>
     <w:pPr>
       <w:keepNext/>
     </w:pPr>
   </w:style>
-  <w:style w:customStyle="1" w:styleId="BodyTextChar" w:type="character">
-    <w:name w:val="Body Text Char"/>
+  <w:style w:type="character" w:customStyle="1" w:styleId="CaptionChar">
+    <w:name w:val="Caption Char"/>
     <w:basedOn w:val="DefaultParagraphFont"/>
-    <w:link w:val="BodyText"/>
-  </w:style>
-  <w:style w:customStyle="1" w:styleId="VerbatimChar" w:type="character">
+    <w:link w:val="Caption"/>
+  </w:style>
+  <w:style w:type="character" w:customStyle="1" w:styleId="VerbatimChar">
     <w:name w:val="Verbatim Char"/>
-    <w:basedOn w:val="BodyTextChar"/>
-    <w:rPr>
-      <w:rFonts w:ascii="Consolas" w:hAnsi="Consolas"/>
-      <w:sz w:val="22"/>
-    </w:rPr>
-  </w:style>
-  <w:style w:customStyle="1" w:styleId="SectionNumber" w:type="character">
+    <w:basedOn w:val="CaptionChar"/>
+    <w:link w:val="SourceCode"/>
+    <w:rPr>
+      <w:rFonts w:ascii="Consolas" w:hAnsi="Consolas"/>
+      <w:sz w:val="22"/>
+    </w:rPr>
+  </w:style>
+  <w:style w:type="character" w:customStyle="1" w:styleId="SectionNumber">
     <w:name w:val="Section Number"/>
-    <w:basedOn w:val="BodyTextChar"/>
-  </w:style>
-  <w:style w:styleId="FootnoteReference" w:type="character">
-    <w:name w:val="Footnote Reference"/>
-    <w:basedOn w:val="BodyTextChar"/>
+    <w:basedOn w:val="CaptionChar"/>
+  </w:style>
+  <w:style w:type="character" w:styleId="FootnoteReference">
+    <w:name w:val="footnote reference"/>
+    <w:basedOn w:val="CaptionChar"/>
     <w:rPr>
       <w:vertAlign w:val="superscript"/>
     </w:rPr>
   </w:style>
-  <w:style w:styleId="Hyperlink" w:type="character">
+  <w:style w:type="character" w:styleId="Hyperlink">
     <w:name w:val="Hyperlink"/>
-    <w:basedOn w:val="BodyTextChar"/>
-    <w:rPr>
-      <w:color w:themeColor="accent1" w:val="4F81BD"/>
-    </w:rPr>
-  </w:style>
-  <w:style w:styleId="TOCHeading" w:type="paragraph">
+    <w:basedOn w:val="CaptionChar"/>
+    <w:rPr>
+      <w:color w:val="156082" w:themeColor="accent1"/>
+    </w:rPr>
+  </w:style>
+  <w:style w:type="paragraph" w:styleId="TOCHeading">
     <w:name w:val="TOC Heading"/>
     <w:basedOn w:val="Heading1"/>
     <w:next w:val="BodyText"/>
@@ -1389,246 +1561,305 @@
       <w:spacing w:before="240" w:line="259" w:lineRule="auto"/>
       <w:outlineLvl w:val="9"/>
     </w:pPr>
-    <w:rPr>
-      <w:rFonts w:asciiTheme="majorHAnsi" w:cstheme="majorBidi" w:eastAsiaTheme="majorEastAsia" w:hAnsiTheme="majorHAnsi"/>
-      <w:b w:val="0"/>
-      <w:bCs w:val="0"/>
-      <w:color w:themeColor="accent1" w:themeShade="BF" w:val="365F91"/>
-    </w:rPr>
   </w:style>
   <w:style w:type="paragraph" w:customStyle="1" w:styleId="SourceCode">
     <w:name w:val="Source Code"/>
     <w:basedOn w:val="Normal"/>
     <w:link w:val="VerbatimChar"/>
     <w:pPr>
-      <w:wordWrap w:val="off"/>
+      <w:wordWrap w:val="0"/>
     </w:pPr>
   </w:style>
   <w:style w:type="character" w:customStyle="1" w:styleId="KeywordTok">
     <w:name w:val="KeywordTok"/>
     <w:basedOn w:val="VerbatimChar"/>
     <w:rPr>
+      <w:rFonts w:ascii="Consolas" w:hAnsi="Consolas"/>
       <w:b/>
       <w:color w:val="007020"/>
+      <w:sz w:val="22"/>
     </w:rPr>
   </w:style>
   <w:style w:type="character" w:customStyle="1" w:styleId="DataTypeTok">
     <w:name w:val="DataTypeTok"/>
     <w:basedOn w:val="VerbatimChar"/>
     <w:rPr>
+      <w:rFonts w:ascii="Consolas" w:hAnsi="Consolas"/>
       <w:color w:val="902000"/>
+      <w:sz w:val="22"/>
     </w:rPr>
   </w:style>
   <w:style w:type="character" w:customStyle="1" w:styleId="DecValTok">
     <w:name w:val="DecValTok"/>
     <w:basedOn w:val="VerbatimChar"/>
     <w:rPr>
-      <w:color w:val="40a070"/>
+      <w:rFonts w:ascii="Consolas" w:hAnsi="Consolas"/>
+      <w:color w:val="40A070"/>
+      <w:sz w:val="22"/>
     </w:rPr>
   </w:style>
   <w:style w:type="character" w:customStyle="1" w:styleId="BaseNTok">
     <w:name w:val="BaseNTok"/>
     <w:basedOn w:val="VerbatimChar"/>
     <w:rPr>
-      <w:color w:val="40a070"/>
+      <w:rFonts w:ascii="Consolas" w:hAnsi="Consolas"/>
+      <w:color w:val="40A070"/>
+      <w:sz w:val="22"/>
     </w:rPr>
   </w:style>
   <w:style w:type="character" w:customStyle="1" w:styleId="FloatTok">
     <w:name w:val="FloatTok"/>
     <w:basedOn w:val="VerbatimChar"/>
     <w:rPr>
-      <w:color w:val="40a070"/>
+      <w:rFonts w:ascii="Consolas" w:hAnsi="Consolas"/>
+      <w:color w:val="40A070"/>
+      <w:sz w:val="22"/>
     </w:rPr>
   </w:style>
   <w:style w:type="character" w:customStyle="1" w:styleId="ConstantTok">
     <w:name w:val="ConstantTok"/>
     <w:basedOn w:val="VerbatimChar"/>
     <w:rPr>
+      <w:rFonts w:ascii="Consolas" w:hAnsi="Consolas"/>
       <w:color w:val="880000"/>
+      <w:sz w:val="22"/>
     </w:rPr>
   </w:style>
   <w:style w:type="character" w:customStyle="1" w:styleId="CharTok">
     <w:name w:val="CharTok"/>
     <w:basedOn w:val="VerbatimChar"/>
     <w:rPr>
-      <w:color w:val="4070a0"/>
+      <w:rFonts w:ascii="Consolas" w:hAnsi="Consolas"/>
+      <w:color w:val="4070A0"/>
+      <w:sz w:val="22"/>
     </w:rPr>
   </w:style>
   <w:style w:type="character" w:customStyle="1" w:styleId="SpecialCharTok">
     <w:name w:val="SpecialCharTok"/>
     <w:basedOn w:val="VerbatimChar"/>
     <w:rPr>
-      <w:color w:val="4070a0"/>
+      <w:rFonts w:ascii="Consolas" w:hAnsi="Consolas"/>
+      <w:color w:val="4070A0"/>
+      <w:sz w:val="22"/>
     </w:rPr>
   </w:style>
   <w:style w:type="character" w:customStyle="1" w:styleId="StringTok">
     <w:name w:val="StringTok"/>
     <w:basedOn w:val="VerbatimChar"/>
     <w:rPr>
-      <w:color w:val="4070a0"/>
+      <w:rFonts w:ascii="Consolas" w:hAnsi="Consolas"/>
+      <w:color w:val="4070A0"/>
+      <w:sz w:val="22"/>
     </w:rPr>
   </w:style>
   <w:style w:type="character" w:customStyle="1" w:styleId="VerbatimStringTok">
     <w:name w:val="VerbatimStringTok"/>
     <w:basedOn w:val="VerbatimChar"/>
     <w:rPr>
-      <w:color w:val="4070a0"/>
+      <w:rFonts w:ascii="Consolas" w:hAnsi="Consolas"/>
+      <w:color w:val="4070A0"/>
+      <w:sz w:val="22"/>
     </w:rPr>
   </w:style>
   <w:style w:type="character" w:customStyle="1" w:styleId="SpecialStringTok">
     <w:name w:val="SpecialStringTok"/>
     <w:basedOn w:val="VerbatimChar"/>
     <w:rPr>
-      <w:color w:val="bb6688"/>
+      <w:rFonts w:ascii="Consolas" w:hAnsi="Consolas"/>
+      <w:color w:val="BB6688"/>
+      <w:sz w:val="22"/>
     </w:rPr>
   </w:style>
   <w:style w:type="character" w:customStyle="1" w:styleId="ImportTok">
     <w:name w:val="ImportTok"/>
     <w:basedOn w:val="VerbatimChar"/>
     <w:rPr>
+      <w:rFonts w:ascii="Consolas" w:hAnsi="Consolas"/>
       <w:b/>
       <w:color w:val="008000"/>
+      <w:sz w:val="22"/>
     </w:rPr>
   </w:style>
   <w:style w:type="character" w:customStyle="1" w:styleId="CommentTok">
     <w:name w:val="CommentTok"/>
     <w:basedOn w:val="VerbatimChar"/>
     <w:rPr>
+      <w:rFonts w:ascii="Consolas" w:hAnsi="Consolas"/>
       <w:i/>
-      <w:color w:val="60a0b0"/>
+      <w:color w:val="60A0B0"/>
+      <w:sz w:val="22"/>
     </w:rPr>
   </w:style>
   <w:style w:type="character" w:customStyle="1" w:styleId="DocumentationTok">
     <w:name w:val="DocumentationTok"/>
     <w:basedOn w:val="VerbatimChar"/>
     <w:rPr>
+      <w:rFonts w:ascii="Consolas" w:hAnsi="Consolas"/>
       <w:i/>
-      <w:color w:val="ba2121"/>
+      <w:color w:val="BA2121"/>
+      <w:sz w:val="22"/>
     </w:rPr>
   </w:style>
   <w:style w:type="character" w:customStyle="1" w:styleId="AnnotationTok">
     <w:name w:val="AnnotationTok"/>
     <w:basedOn w:val="VerbatimChar"/>
     <w:rPr>
+      <w:rFonts w:ascii="Consolas" w:hAnsi="Consolas"/>
       <w:b/>
       <w:i/>
-      <w:color w:val="60a0b0"/>
+      <w:color w:val="60A0B0"/>
+      <w:sz w:val="22"/>
     </w:rPr>
   </w:style>
   <w:style w:type="character" w:customStyle="1" w:styleId="CommentVarTok">
     <w:name w:val="CommentVarTok"/>
     <w:basedOn w:val="VerbatimChar"/>
     <w:rPr>
+      <w:rFonts w:ascii="Consolas" w:hAnsi="Consolas"/>
       <w:b/>
       <w:i/>
-      <w:color w:val="60a0b0"/>
+      <w:color w:val="60A0B0"/>
+      <w:sz w:val="22"/>
     </w:rPr>
   </w:style>
   <w:style w:type="character" w:customStyle="1" w:styleId="OtherTok">
     <w:name w:val="OtherTok"/>
     <w:basedOn w:val="VerbatimChar"/>
     <w:rPr>
+      <w:rFonts w:ascii="Consolas" w:hAnsi="Consolas"/>
       <w:color w:val="007020"/>
+      <w:sz w:val="22"/>
     </w:rPr>
   </w:style>
   <w:style w:type="character" w:customStyle="1" w:styleId="FunctionTok">
     <w:name w:val="FunctionTok"/>
     <w:basedOn w:val="VerbatimChar"/>
     <w:rPr>
-      <w:color w:val="06287e"/>
+      <w:rFonts w:ascii="Consolas" w:hAnsi="Consolas"/>
+      <w:color w:val="06287E"/>
+      <w:sz w:val="22"/>
     </w:rPr>
   </w:style>
   <w:style w:type="character" w:customStyle="1" w:styleId="VariableTok">
     <w:name w:val="VariableTok"/>
     <w:basedOn w:val="VerbatimChar"/>
     <w:rPr>
-      <w:color w:val="19177c"/>
+      <w:rFonts w:ascii="Consolas" w:hAnsi="Consolas"/>
+      <w:color w:val="19177C"/>
+      <w:sz w:val="22"/>
     </w:rPr>
   </w:style>
   <w:style w:type="character" w:customStyle="1" w:styleId="ControlFlowTok">
     <w:name w:val="ControlFlowTok"/>
     <w:basedOn w:val="VerbatimChar"/>
     <w:rPr>
+      <w:rFonts w:ascii="Consolas" w:hAnsi="Consolas"/>
       <w:b/>
       <w:color w:val="007020"/>
+      <w:sz w:val="22"/>
     </w:rPr>
   </w:style>
   <w:style w:type="character" w:customStyle="1" w:styleId="OperatorTok">
     <w:name w:val="OperatorTok"/>
     <w:basedOn w:val="VerbatimChar"/>
     <w:rPr>
+      <w:rFonts w:ascii="Consolas" w:hAnsi="Consolas"/>
       <w:color w:val="666666"/>
+      <w:sz w:val="22"/>
     </w:rPr>
   </w:style>
   <w:style w:type="character" w:customStyle="1" w:styleId="BuiltInTok">
     <w:name w:val="BuiltInTok"/>
     <w:basedOn w:val="VerbatimChar"/>
     <w:rPr>
+      <w:rFonts w:ascii="Consolas" w:hAnsi="Consolas"/>
       <w:color w:val="008000"/>
+      <w:sz w:val="22"/>
     </w:rPr>
   </w:style>
   <w:style w:type="character" w:customStyle="1" w:styleId="ExtensionTok">
     <w:name w:val="ExtensionTok"/>
     <w:basedOn w:val="VerbatimChar"/>
-    <w:rPr/>
+    <w:rPr>
+      <w:rFonts w:ascii="Consolas" w:hAnsi="Consolas"/>
+      <w:sz w:val="22"/>
+    </w:rPr>
   </w:style>
   <w:style w:type="character" w:customStyle="1" w:styleId="PreprocessorTok">
     <w:name w:val="PreprocessorTok"/>
     <w:basedOn w:val="VerbatimChar"/>
     <w:rPr>
-      <w:color w:val="bc7a00"/>
+      <w:rFonts w:ascii="Consolas" w:hAnsi="Consolas"/>
+      <w:color w:val="BC7A00"/>
+      <w:sz w:val="22"/>
     </w:rPr>
   </w:style>
   <w:style w:type="character" w:customStyle="1" w:styleId="AttributeTok">
     <w:name w:val="AttributeTok"/>
     <w:basedOn w:val="VerbatimChar"/>
     <w:rPr>
-      <w:color w:val="7d9029"/>
+      <w:rFonts w:ascii="Consolas" w:hAnsi="Consolas"/>
+      <w:color w:val="7D9029"/>
+      <w:sz w:val="22"/>
     </w:rPr>
   </w:style>
   <w:style w:type="character" w:customStyle="1" w:styleId="RegionMarkerTok">
     <w:name w:val="RegionMarkerTok"/>
     <w:basedOn w:val="VerbatimChar"/>
-    <w:rPr/>
+    <w:rPr>
+      <w:rFonts w:ascii="Consolas" w:hAnsi="Consolas"/>
+      <w:sz w:val="22"/>
+    </w:rPr>
   </w:style>
   <w:style w:type="character" w:customStyle="1" w:styleId="InformationTok">
     <w:name w:val="InformationTok"/>
     <w:basedOn w:val="VerbatimChar"/>
     <w:rPr>
+      <w:rFonts w:ascii="Consolas" w:hAnsi="Consolas"/>
       <w:b/>
       <w:i/>
-      <w:color w:val="60a0b0"/>
+      <w:color w:val="60A0B0"/>
+      <w:sz w:val="22"/>
     </w:rPr>
   </w:style>
   <w:style w:type="character" w:customStyle="1" w:styleId="WarningTok">
     <w:name w:val="WarningTok"/>
     <w:basedOn w:val="VerbatimChar"/>
     <w:rPr>
+      <w:rFonts w:ascii="Consolas" w:hAnsi="Consolas"/>
       <w:b/>
       <w:i/>
-      <w:color w:val="60a0b0"/>
+      <w:color w:val="60A0B0"/>
+      <w:sz w:val="22"/>
     </w:rPr>
   </w:style>
   <w:style w:type="character" w:customStyle="1" w:styleId="AlertTok">
     <w:name w:val="AlertTok"/>
     <w:basedOn w:val="VerbatimChar"/>
     <w:rPr>
+      <w:rFonts w:ascii="Consolas" w:hAnsi="Consolas"/>
       <w:b/>
-      <w:color w:val="ff0000"/>
+      <w:color w:val="FF0000"/>
+      <w:sz w:val="22"/>
     </w:rPr>
   </w:style>
   <w:style w:type="character" w:customStyle="1" w:styleId="ErrorTok">
     <w:name w:val="ErrorTok"/>
     <w:basedOn w:val="VerbatimChar"/>
     <w:rPr>
+      <w:rFonts w:ascii="Consolas" w:hAnsi="Consolas"/>
       <w:b/>
-      <w:color w:val="ff0000"/>
+      <w:color w:val="FF0000"/>
+      <w:sz w:val="22"/>
     </w:rPr>
   </w:style>
   <w:style w:type="character" w:customStyle="1" w:styleId="NormalTok">
     <w:name w:val="NormalTok"/>
     <w:basedOn w:val="VerbatimChar"/>
-    <w:rPr/>
+    <w:rPr>
+      <w:rFonts w:ascii="Consolas" w:hAnsi="Consolas"/>
+      <w:sz w:val="22"/>
+    </w:rPr>
   </w:style>
 </w:styles>
 </file>

</xml_diff>